<commit_message>
Build multilingual DOCX and PDF editions
</commit_message>
<xml_diff>
--- a/01-foundations/CIS_Controls_v8.1/Espanol/CIS_Critical_Security_Controls_v8.1_Practical_Manager_and_Junior_Analyst_Manual_Espanol_v1.0.docx
+++ b/01-foundations/CIS_Controls_v8.1/Espanol/CIS_Critical_Security_Controls_v8.1_Practical_Manager_and_Junior_Analyst_Manual_Espanol_v1.0.docx
@@ -2,32 +2,6 @@
 <file path=word/document.xml><?xml version="1.0" encoding="utf-8"?>
 <w:document xmlns:w="http://schemas.openxmlformats.org/wordprocessingml/2006/main" xmlns:m="http://schemas.openxmlformats.org/officeDocument/2006/math" xmlns:r="http://schemas.openxmlformats.org/officeDocument/2006/relationships" xmlns:o="urn:schemas-microsoft-com:office:office" xmlns:v="urn:schemas-microsoft-com:vml" xmlns:w10="urn:schemas-microsoft-com:office:word" xmlns:a="http://schemas.openxmlformats.org/drawingml/2006/main" xmlns:pic="http://schemas.openxmlformats.org/drawingml/2006/picture" xmlns:wp="http://schemas.openxmlformats.org/drawingml/2006/wordprocessingDrawing">
   <w:body>
-    <w:sdt>
-      <w:sdtPr>
-        <w:docPartObj>
-          <w:docPartGallery w:val="Table of Contents"/>
-          <w:docPartUnique/>
-        </w:docPartObj>
-      </w:sdtPr>
-      <w:sdtContent>
-        <w:p>
-          <w:pPr>
-            <w:pStyle w:val="TOCHeading"/>
-          </w:pPr>
-          <w:r>
-            <w:t xml:space="preserve">Table of Contents</w:t>
-          </w:r>
-        </w:p>
-        <w:p>
-          <w:r>
-            <w:fldChar w:fldCharType="begin" w:dirty="true"/>
-            <w:instrText xml:space="preserve">TOC \o "1-3" \h \z \u</w:instrText>
-            <w:fldChar w:fldCharType="separate"/>
-            <w:fldChar w:fldCharType="end"/>
-          </w:r>
-        </w:p>
-      </w:sdtContent>
-    </w:sdt>
     <w:p>
       <w:pPr>
         <w:pStyle w:val="BlockText"/>

</xml_diff>

<commit_message>
Generate multilingual drafts and record workflow diagnostics
</commit_message>
<xml_diff>
--- a/01-foundations/CIS_Controls_v8.1/Espanol/CIS_Critical_Security_Controls_v8.1_Practical_Manager_and_Junior_Analyst_Manual_Espanol_v1.0.docx
+++ b/01-foundations/CIS_Controls_v8.1/Espanol/CIS_Critical_Security_Controls_v8.1_Practical_Manager_and_Junior_Analyst_Manual_Espanol_v1.0.docx
@@ -2,6 +2,32 @@
 <file path=word/document.xml><?xml version="1.0" encoding="utf-8"?>
 <w:document xmlns:w="http://schemas.openxmlformats.org/wordprocessingml/2006/main" xmlns:m="http://schemas.openxmlformats.org/officeDocument/2006/math" xmlns:r="http://schemas.openxmlformats.org/officeDocument/2006/relationships" xmlns:o="urn:schemas-microsoft-com:office:office" xmlns:v="urn:schemas-microsoft-com:vml" xmlns:w10="urn:schemas-microsoft-com:office:word" xmlns:a="http://schemas.openxmlformats.org/drawingml/2006/main" xmlns:pic="http://schemas.openxmlformats.org/drawingml/2006/picture" xmlns:wp="http://schemas.openxmlformats.org/drawingml/2006/wordprocessingDrawing">
   <w:body>
+    <w:sdt>
+      <w:sdtPr>
+        <w:docPartObj>
+          <w:docPartGallery w:val="Table of Contents"/>
+          <w:docPartUnique/>
+        </w:docPartObj>
+      </w:sdtPr>
+      <w:sdtContent>
+        <w:p>
+          <w:pPr>
+            <w:pStyle w:val="TOCHeading"/>
+          </w:pPr>
+          <w:r>
+            <w:t xml:space="preserve">Table of Contents</w:t>
+          </w:r>
+        </w:p>
+        <w:p>
+          <w:r>
+            <w:fldChar w:fldCharType="begin" w:dirty="true"/>
+            <w:instrText xml:space="preserve">TOC \o "1-3" \h \z \u</w:instrText>
+            <w:fldChar w:fldCharType="separate"/>
+            <w:fldChar w:fldCharType="end"/>
+          </w:r>
+        </w:p>
+      </w:sdtContent>
+    </w:sdt>
     <w:p>
       <w:pPr>
         <w:pStyle w:val="BlockText"/>

</xml_diff>

<commit_message>
Repair malformed localized image tags
</commit_message>
<xml_diff>
--- a/01-foundations/CIS_Controls_v8.1/Espanol/CIS_Critical_Security_Controls_v8.1_Practical_Manager_and_Junior_Analyst_Manual_Espanol_v1.0.docx
+++ b/01-foundations/CIS_Controls_v8.1/Espanol/CIS_Critical_Security_Controls_v8.1_Practical_Manager_and_Junior_Analyst_Manual_Espanol_v1.0.docx
@@ -1771,39 +1771,6 @@
       <w:pPr>
         <w:pStyle w:val="BodyText"/>
       </w:pPr>
-      <w:r>
-        <w:t xml:space="preserve">&lt;img src=</w:t>
-      </w:r>
-      <w:r>
-        <w:t xml:space="preserve">“media/image3.png”</w:t>
-      </w:r>
-      <w:r>
-        <w:t xml:space="preserve"> </w:t>
-      </w:r>
-      <w:r>
-        <w:t xml:space="preserve">estilo=</w:t>
-      </w:r>
-      <w:r>
-        <w:t xml:space="preserve">“width:6.15in;height:2.87986in”</w:t>
-      </w:r>
-      <w:r>
-        <w:t xml:space="preserve"> </w:t>
-      </w:r>
-      <w:r>
-        <w:t xml:space="preserve">alt=</w:t>
-      </w:r>
-      <w:r>
-        <w:t xml:space="preserve"> </w:t>
-      </w:r>
-      <w:r>
-        <w:t xml:space="preserve">“La especificación oficial pasa de los datos definidos a las operaciones, medidas, métricas y revisión de procedimiento.”</w:t>
-      </w:r>
-      <w:r>
-        <w:t xml:space="preserve"> </w:t>
-      </w:r>
-      <w:r>
-        <w:t xml:space="preserve">/</w:t>
-      </w:r>
     </w:p>
     <w:p>
       <w:pPr>

</xml_diff>

<commit_message>
Generate and verify multilingual GRC draft packages
</commit_message>
<xml_diff>
--- a/01-foundations/CIS_Controls_v8.1/Espanol/CIS_Critical_Security_Controls_v8.1_Practical_Manager_and_Junior_Analyst_Manual_Espanol_v1.0.docx
+++ b/01-foundations/CIS_Controls_v8.1/Espanol/CIS_Critical_Security_Controls_v8.1_Practical_Manager_and_Junior_Analyst_Manual_Espanol_v1.0.docx
@@ -2,6 +2,32 @@
 <file path=word/document.xml><?xml version="1.0" encoding="utf-8"?>
 <w:document xmlns:w="http://schemas.openxmlformats.org/wordprocessingml/2006/main" xmlns:m="http://schemas.openxmlformats.org/officeDocument/2006/math" xmlns:r="http://schemas.openxmlformats.org/officeDocument/2006/relationships" xmlns:o="urn:schemas-microsoft-com:office:office" xmlns:v="urn:schemas-microsoft-com:vml" xmlns:w10="urn:schemas-microsoft-com:office:word" xmlns:a="http://schemas.openxmlformats.org/drawingml/2006/main" xmlns:pic="http://schemas.openxmlformats.org/drawingml/2006/picture" xmlns:wp="http://schemas.openxmlformats.org/drawingml/2006/wordprocessingDrawing">
   <w:body>
+    <w:sdt>
+      <w:sdtPr>
+        <w:docPartObj>
+          <w:docPartGallery w:val="Table of Contents"/>
+          <w:docPartUnique/>
+        </w:docPartObj>
+      </w:sdtPr>
+      <w:sdtContent>
+        <w:p>
+          <w:pPr>
+            <w:pStyle w:val="TOCHeading"/>
+          </w:pPr>
+          <w:r>
+            <w:t xml:space="preserve">Table of Contents</w:t>
+          </w:r>
+        </w:p>
+        <w:p>
+          <w:r>
+            <w:fldChar w:fldCharType="begin" w:dirty="true"/>
+            <w:instrText xml:space="preserve">TOC \o "1-3" \h \z \u</w:instrText>
+            <w:fldChar w:fldCharType="separate"/>
+            <w:fldChar w:fldCharType="end"/>
+          </w:r>
+        </w:p>
+      </w:sdtContent>
+    </w:sdt>
     <w:p>
       <w:pPr>
         <w:pStyle w:val="BlockText"/>

</xml_diff>

<commit_message>
Rebuild validated CIS Spanish publication
</commit_message>
<xml_diff>
--- a/01-foundations/CIS_Controls_v8.1/Espanol/CIS_Critical_Security_Controls_v8.1_Practical_Manager_and_Junior_Analyst_Manual_Espanol_v1.0.docx
+++ b/01-foundations/CIS_Controls_v8.1/Espanol/CIS_Critical_Security_Controls_v8.1_Practical_Manager_and_Junior_Analyst_Manual_Espanol_v1.0.docx
@@ -2,32 +2,6 @@
 <file path=word/document.xml><?xml version="1.0" encoding="utf-8"?>
 <w:document xmlns:w="http://schemas.openxmlformats.org/wordprocessingml/2006/main" xmlns:m="http://schemas.openxmlformats.org/officeDocument/2006/math" xmlns:r="http://schemas.openxmlformats.org/officeDocument/2006/relationships" xmlns:o="urn:schemas-microsoft-com:office:office" xmlns:v="urn:schemas-microsoft-com:vml" xmlns:w10="urn:schemas-microsoft-com:office:word" xmlns:a="http://schemas.openxmlformats.org/drawingml/2006/main" xmlns:pic="http://schemas.openxmlformats.org/drawingml/2006/picture" xmlns:wp="http://schemas.openxmlformats.org/drawingml/2006/wordprocessingDrawing">
   <w:body>
-    <w:sdt>
-      <w:sdtPr>
-        <w:docPartObj>
-          <w:docPartGallery w:val="Table of Contents"/>
-          <w:docPartUnique/>
-        </w:docPartObj>
-      </w:sdtPr>
-      <w:sdtContent>
-        <w:p>
-          <w:pPr>
-            <w:pStyle w:val="TOCHeading"/>
-          </w:pPr>
-          <w:r>
-            <w:t xml:space="preserve">Table of Contents</w:t>
-          </w:r>
-        </w:p>
-        <w:p>
-          <w:r>
-            <w:fldChar w:fldCharType="begin" w:dirty="true"/>
-            <w:instrText xml:space="preserve">TOC \o "1-3" \h \z \u</w:instrText>
-            <w:fldChar w:fldCharType="separate"/>
-            <w:fldChar w:fldCharType="end"/>
-          </w:r>
-        </w:p>
-      </w:sdtContent>
-    </w:sdt>
     <w:p>
       <w:pPr>
         <w:pStyle w:val="BlockText"/>
@@ -43,7 +17,7 @@
         <w:t xml:space="preserve"> </w:t>
       </w:r>
       <w:r>
-        <w:t xml:space="preserve">Borrador de traducción asistida por máquina. Requiere revisión humana de terminología, significado, enlaces, formato y vigencia técnica antes de marcarse como edición final.</w:t>
+        <w:t xml:space="preserve">Edición de revisión controlada. Requiere validación humana de terminología, significado, enlaces, formato, accesibilidad y vigencia técnica antes de la publicación final.</w:t>
       </w:r>
     </w:p>
     <w:p>
@@ -55,7 +29,7 @@
           <w:bCs/>
           <w:b/>
         </w:rPr>
-        <w:t xml:space="preserve">CYBERSECURITY, PRIVACY &amp; COMPLIANCE SERIES</w:t>
+        <w:t xml:space="preserve">SERIE PRÁCTICA DE CIBERSEGURIDAD, PRIVACIDAD Y CUMPLIMIENTO</w:t>
       </w:r>
     </w:p>
     <w:p>
@@ -67,7 +41,7 @@
           <w:bCs/>
           <w:b/>
         </w:rPr>
-        <w:t xml:space="preserve">CIS Controles de Seguridad Crítica v8.1</w:t>
+        <w:t xml:space="preserve">CIS Critical Security Controls v8.1</w:t>
       </w:r>
     </w:p>
     <w:p>
@@ -75,7 +49,11 @@
         <w:pStyle w:val="BodyText"/>
       </w:pPr>
       <w:r>
-        <w:t xml:space="preserve">** Aplicación práctica, medición, evidencia y herramientas de código abierto**</w:t>
+        <w:rPr>
+          <w:bCs/>
+          <w:b/>
+        </w:rPr>
+        <w:t xml:space="preserve">Implementación práctica, medición, evidencia y herramientas de código abierto</w:t>
       </w:r>
     </w:p>
     <w:p>
@@ -87,7 +65,7 @@
           <w:iCs/>
           <w:i/>
         </w:rPr>
-        <w:t xml:space="preserve">Un manual de trabajo para administradores, analistas juniores, estudiantes, cambiadores de carrera, asesores y equipos de seguridad</w:t>
+        <w:t xml:space="preserve">Manual de trabajo para gestores, analistas júnior, estudiantes, profesionales en transición de carrera, evaluadores y equipos de seguridad</w:t>
       </w:r>
     </w:p>
     <w:p>
@@ -107,7 +85,7 @@
         <w:pStyle w:val="BodyText"/>
       </w:pPr>
       <w:r>
-        <w:t xml:space="preserve">Primera edición • Julio 2026</w:t>
+        <w:t xml:space="preserve">Primera edición • Julio de 2026</w:t>
       </w:r>
     </w:p>
     <w:tbl>
@@ -136,25 +114,25 @@
                 <w:bCs/>
                 <w:b/>
               </w:rPr>
-              <w:t xml:space="preserve">Inside:</w:t>
+              <w:t xml:space="preserve">Contenido:</w:t>
             </w:r>
             <w:r>
               <w:t xml:space="preserve"> </w:t>
             </w:r>
             <w:r>
-              <w:t xml:space="preserve">18 Controles • 153 Salvaguardias • IG1, IG2, IG3 • medición • evidencia • herramientas • manual de gestión • laboratorios • preparación de la carrera</w:t>
+              <w:t xml:space="preserve">18 Controles • 153 Salvaguardas • IG1, IG2 e IG3 • medición • evidencia • herramientas • guía para gestores • laboratorios • preparación profesional</w:t>
             </w:r>
           </w:p>
         </w:tc>
       </w:tr>
     </w:tbl>
-    <w:bookmarkStart w:id="21" w:name="publication-and-use-notice"/>
+    <w:bookmarkStart w:id="21" w:name="aviso-de-publicación-y-uso"/>
     <w:p>
       <w:pPr>
         <w:pStyle w:val="Heading1"/>
       </w:pPr>
       <w:r>
-        <w:t xml:space="preserve">Publication and Use Notice</w:t>
+        <w:t xml:space="preserve">Aviso de publicación y uso</w:t>
       </w:r>
     </w:p>
     <w:p>
@@ -170,7 +148,7 @@
         <w:pStyle w:val="BodyText"/>
       </w:pPr>
       <w:r>
-        <w:t xml:space="preserve">Edición: Primera edición, Julio 2026</w:t>
+        <w:t xml:space="preserve">Edición: Primera edición, julio de 2026</w:t>
       </w:r>
     </w:p>
     <w:p>
@@ -178,7 +156,7 @@
         <w:pStyle w:val="BodyText"/>
       </w:pPr>
       <w:r>
-        <w:t xml:space="preserve">Este manual educativo independiente no es un Centro para la publicación, certificación, acreditación, informe de auditoría, opinión legal o garantía de seguridad o cumplimiento. Controles CIS y CIS Los parámetros son marcas comerciales del Centro de Seguridad de Internet. Utilice los recursos oficiales CIS para el contenido exacto y la orientación actual.</w:t>
+        <w:t xml:space="preserve">Este manual educativo independiente no es una publicación, certificación, acreditación, informe de auditoría, opinión jurídica ni garantía de seguridad o cumplimiento emitida por el Center for Internet Security. CIS Controls y CIS Benchmarks son marcas del Center for Internet Security. Consulte los recursos oficiales de CIS para obtener el contenido exacto y la orientación vigente.</w:t>
       </w:r>
     </w:p>
     <w:p>
@@ -186,7 +164,7 @@
         <w:pStyle w:val="BodyText"/>
       </w:pPr>
       <w:r>
-        <w:t xml:space="preserve">Los controles CIS son las mejores prácticas de ciberseguridad. No reemplazan las leyes, reglamentos, contratos, requisitos sectoriales, evaluación de riesgos o responsabilidad de gestión aplicables. Un mapeo muestra relaciones; no prueba automáticamente el cumplimiento de otro marco.</w:t>
+        <w:t xml:space="preserve">Los CIS Controls representan buenas prácticas de ciberseguridad. No sustituyen las leyes, los reglamentos, los contratos, los requisitos sectoriales, las evaluaciones de riesgo ni las responsabilidades de gestión aplicables. Una correspondencia entre marcos muestra relaciones; no demuestra automáticamente el cumplimiento de otro marco.</w:t>
       </w:r>
     </w:p>
     <w:bookmarkStart w:id="20" w:name="uso-ético-y-autorizado"/>
@@ -203,7 +181,7 @@
         <w:pStyle w:val="FirstParagraph"/>
       </w:pPr>
       <w:r>
-        <w:t xml:space="preserve">Utilice herramientas técnicas únicamente en activos, redes, aplicaciones, cuentas de nube, repositorios y datos que posee o está específicamente autorizado por escrito para evaluar. Use información sintética y sistemas aislados en laboratorios.</w:t>
+        <w:t xml:space="preserve">Utilice herramientas técnicas únicamente en activos, redes, aplicaciones, cuentas de nube, repositorios y datos que posea o para los que haya recibido autorización específica por escrito. En los laboratorios, utilice información sintética y sistemas aislados.</w:t>
       </w:r>
     </w:p>
     <w:bookmarkEnd w:id="20"/>
@@ -226,7 +204,7 @@
           <w:iCs/>
           <w:i/>
         </w:rPr>
-        <w:t xml:space="preserve">Una introducción práctica para priorizar la defensa cibernética y la medición basada en evidencia.</w:t>
+        <w:t xml:space="preserve">Introducción práctica a la defensa cibernética priorizada y a la medición basada en evidencia.</w:t>
       </w:r>
     </w:p>
     <w:p>
@@ -234,7 +212,7 @@
         <w:pStyle w:val="BodyText"/>
       </w:pPr>
       <w:r>
-        <w:t xml:space="preserve">Los Controles CIS convierten las necesidades defensivas comunes en salvaguardias focalizadas. Su fuerza es la priorización práctica: saber lo que posee, controlar software y datos, asegurar configuraciones e identidades, gestionar vulnerabilidades y registros, prepararse para perturbaciones y ataques, y probar si las defensas funcionan.</w:t>
+        <w:t xml:space="preserve">Los CIS Controls convierten necesidades defensivas comunes en Salvaguardas específicas. Su principal fortaleza es la priorización práctica: conocer los activos, controlar el software y los datos, proteger configuraciones e identidades, gestionar vulnerabilidades y registros, prepararse para interrupciones y ataques, y comprobar si las defensas funcionan.</w:t>
       </w:r>
     </w:p>
     <w:p>
@@ -242,7 +220,7 @@
         <w:pStyle w:val="BodyText"/>
       </w:pPr>
       <w:r>
-        <w:t xml:space="preserve">La versión 8.1 es la edición actual. Se trata de una actualización iterativa al v8 que realineed mappings to NIST CSF 2.0, definiciones ampliadas de plazo reserva, clases de activos revisados y cartografías de Salvaguardia, problemas menores corregidos, aclarar algunas Salvaguardias, e incorporar la función de seguridad de Govern en las cartografías. Los 18 Controles y 153 Salvaguardias siguen siendo la estructura central.</w:t>
+        <w:t xml:space="preserve">La versión 8.1 es una actualización iterativa de la versión 8. Realineó las correspondencias con NIST CSF 2.0, amplió definiciones de términos reservados, revisó clases de activos y correspondencias de Salvaguardas, corrigió cuestiones menores, aclaró determinadas Salvaguardas e incorporó la función Gobernar a las correspondencias. Los 18 Controles y las 153 Salvaguardas continúan siendo la estructura central.</w:t>
       </w:r>
     </w:p>
     <w:p>
@@ -250,12 +228,14 @@
         <w:pStyle w:val="BodyText"/>
       </w:pPr>
       <w:r>
-        <w:t xml:space="preserve">Una instalación de herramientas no es la implementación. La aplicación efectiva requiere un alcance definido, poblaciones completas, configuración segura, pruebas operativas, propietarios capacitados, manejo de excepciones, medición, corrección y retesting. Los administradores deciden prioridades y recursos; los analistas hacen que esas decisiones sean fiables mediante inventarios y pruebas precisos.</w:t>
-      </w:r>
-    </w:p>
-    <w:p>
-      <w:pPr>
-        <w:pStyle w:val="BodyText"/>
+        <w:t xml:space="preserve">La instalación de una herramienta no equivale a la implementación de un control. Una implementación efectiva exige un alcance definido, poblaciones completas, configuración segura, evidencia operativa, responsables capacitados, tratamiento de excepciones, medición, corrección y repetición de pruebas. Los gestores definen prioridades y recursos; los analistas hacen que esas decisiones sean confiables mediante inventarios y evidencia precisos.</w:t>
+      </w:r>
+    </w:p>
+    <w:bookmarkEnd w:id="22"/>
+    <w:bookmarkStart w:id="23" w:name="cómo-utilizar-este-manual"/>
+    <w:p>
+      <w:pPr>
+        <w:pStyle w:val="Heading1"/>
       </w:pPr>
       <w:r>
         <w:t xml:space="preserve">Cómo utilizar este manual</w:t>
@@ -267,9 +247,10 @@
           <w:ilvl w:val="0"/>
           <w:numId w:val="1001"/>
         </w:numPr>
-      </w:pPr>
-      <w:r>
-        <w:t xml:space="preserve">Los administradores deben comenzar con los Capítulos 1-5 y 24–25.</w:t>
+        <w:pStyle w:val="Compact"/>
+      </w:pPr>
+      <w:r>
+        <w:t xml:space="preserve">Los gestores deben comenzar con los capítulos 1–5 y 24–25.</w:t>
       </w:r>
     </w:p>
     <w:p>
@@ -278,9 +259,10 @@
           <w:ilvl w:val="0"/>
           <w:numId w:val="1001"/>
         </w:numPr>
-      </w:pPr>
-      <w:r>
-        <w:t xml:space="preserve">Los analistas juniores deben estudiar los 18 capítulos de Control, método de medición, herramientas, laboratorio y capítulo de entrevista.</w:t>
+        <w:pStyle w:val="Compact"/>
+      </w:pPr>
+      <w:r>
+        <w:t xml:space="preserve">Los analistas júnior deben estudiar los 18 capítulos de Controles, el método de medición, las herramientas, el laboratorio y el capítulo de entrevistas.</w:t>
       </w:r>
     </w:p>
     <w:p>
@@ -289,9 +271,10 @@
           <w:ilvl w:val="0"/>
           <w:numId w:val="1001"/>
         </w:numPr>
-      </w:pPr>
-      <w:r>
-        <w:t xml:space="preserve">Los equipos técnicos deben conectar cada Salvaguardia a activos, datos, propietarios, procedimientos, configuración, monitoreo, manejo de excepciones y pruebas.</w:t>
+        <w:pStyle w:val="Compact"/>
+      </w:pPr>
+      <w:r>
+        <w:t xml:space="preserve">Los equipos técnicos deben relacionar cada Salvaguarda con activos, datos, responsables, procedimientos, configuraciones, monitoreo, excepciones y evidencia.</w:t>
       </w:r>
     </w:p>
     <w:p>
@@ -300,27 +283,52 @@
           <w:ilvl w:val="0"/>
           <w:numId w:val="1001"/>
         </w:numPr>
-      </w:pPr>
-      <w:r>
-        <w:t xml:space="preserve">Los evaluadores deben utilizar la Evaluación oficial de Controles CIS Especificación de insumos, operaciones, medidas, métricas, suposiciones y exámenes de procedimiento.</w:t>
-      </w:r>
-    </w:p>
-    <w:p>
-      <w:pPr>
-        <w:pStyle w:val="FirstParagraph"/>
-      </w:pPr>
-      <w:r>
-        <w:t xml:space="preserve">Contenido de la palabra:** Este documento contiene un campo de mesa de contenido de Word nativo. La guía del capítulo contendrá números de página verificados para esta edición. Después de editar, haga clic con el botón derecho en el contenido y elija el campo de actualización, luego actualice la tabla completa.</w:t>
-      </w:r>
-      <w:r>
-        <w:t xml:space="preserve"> </w:t>
-      </w:r>
-      <w:r>
-        <w:t xml:space="preserve">|. |</w:t>
-      </w:r>
-    </w:p>
-    <w:bookmarkEnd w:id="22"/>
-    <w:bookmarkStart w:id="23" w:name="tabla-de-contenidos"/>
+        <w:pStyle w:val="Compact"/>
+      </w:pPr>
+      <w:r>
+        <w:t xml:space="preserve">Los evaluadores deben utilizar la especificación oficial de evaluación de CIS Controls para confirmar entradas, operaciones, medidas, métricas, supuestos y revisiones de procedimientos.</w:t>
+      </w:r>
+    </w:p>
+    <w:tbl>
+      <w:tblPr>
+        <w:tblStyle w:val="Table"/>
+        <w:tblW w:type="pct" w:w="5000"/>
+        <w:tblLook w:firstRow="1" w:lastRow="0" w:firstColumn="0" w:lastColumn="0" w:noHBand="0" w:noVBand="0" w:val="0020"/>
+        <w:jc w:val="start"/>
+      </w:tblPr>
+      <w:tblGrid>
+        <w:gridCol w:w="7920"/>
+      </w:tblGrid>
+      <w:tr>
+        <w:trPr>
+          <w:tblHeader w:val="true"/>
+        </w:trPr>
+        <w:tc>
+          <w:tcPr/>
+          <w:p>
+            <w:pPr>
+              <w:pStyle w:val="Compact"/>
+              <w:jc w:val="left"/>
+            </w:pPr>
+            <w:r>
+              <w:rPr>
+                <w:bCs/>
+                <w:b/>
+              </w:rPr>
+              <w:t xml:space="preserve">Tabla de contenido en Word:</w:t>
+            </w:r>
+            <w:r>
+              <w:t xml:space="preserve"> </w:t>
+            </w:r>
+            <w:r>
+              <w:t xml:space="preserve">El archivo DOCX puede contener un campo nativo de tabla de contenido. Después de cualquier edición, actualice el campo y seleccione la opción para actualizar toda la tabla.</w:t>
+            </w:r>
+          </w:p>
+        </w:tc>
+      </w:tr>
+    </w:tbl>
+    <w:bookmarkEnd w:id="23"/>
+    <w:bookmarkStart w:id="24" w:name="tabla-de-contenidos"/>
     <w:p>
       <w:pPr>
         <w:pStyle w:val="Heading1"/>
@@ -331,864 +339,189 @@
     </w:p>
     <w:p>
       <w:pPr>
-        <w:pStyle w:val="FirstParagraph"/>
-      </w:pPr>
-      <w:hyperlink w:anchor="publication-and-use-notice">
-        <w:r>
-          <w:rPr>
-            <w:rStyle w:val="Hyperlink"/>
-          </w:rPr>
-          <w:t xml:space="preserve">Notificación de publicación y uso [2](#publication-and-use-notice)</w:t>
-        </w:r>
-      </w:hyperlink>
-    </w:p>
-    <w:p>
-      <w:pPr>
-        <w:pStyle w:val="BodyText"/>
-      </w:pPr>
-      <w:hyperlink w:anchor="ethical-and-authorized-use">
-        <w:r>
-          <w:rPr>
-            <w:rStyle w:val="Hyperlink"/>
-          </w:rPr>
-          <w:t xml:space="preserve">Uso electrónico y autorizado [2] (#ethical-and-authorized-use)</w:t>
-        </w:r>
-      </w:hyperlink>
-    </w:p>
-    <w:p>
-      <w:pPr>
-        <w:pStyle w:val="BodyText"/>
-      </w:pPr>
-      <w:hyperlink w:anchor="preface">
-        <w:r>
-          <w:rPr>
-            <w:rStyle w:val="Hyperlink"/>
-          </w:rPr>
-          <w:t xml:space="preserve">Prefacio [3] (#preface)</w:t>
-        </w:r>
-      </w:hyperlink>
-    </w:p>
-    <w:p>
-      <w:pPr>
-        <w:pStyle w:val="BodyText"/>
-      </w:pPr>
-      <w:hyperlink w:anchor="how-to-use-this-manual">
-        <w:r>
-          <w:rPr>
-            <w:rStyle w:val="Hyperlink"/>
-          </w:rPr>
-          <w:t xml:space="preserve">Cómo utilizar este manual [4](#how-to-use-this-manual)</w:t>
-        </w:r>
-      </w:hyperlink>
-    </w:p>
-    <w:p>
-      <w:pPr>
-        <w:pStyle w:val="BodyText"/>
-      </w:pPr>
-      <w:hyperlink w:anchor="table-of-contents">
-        <w:r>
-          <w:rPr>
-            <w:rStyle w:val="Hyperlink"/>
-          </w:rPr>
-          <w:t xml:space="preserve">Tabla de contenidos [4](#table-of-contents)</w:t>
-        </w:r>
-      </w:hyperlink>
-    </w:p>
-    <w:p>
-      <w:pPr>
-        <w:pStyle w:val="BodyText"/>
-      </w:pPr>
-      <w:hyperlink w:anchor="cis-controls-v8.1-foundations">
-        <w:r>
-          <w:rPr>
-            <w:rStyle w:val="Hyperlink"/>
-          </w:rPr>
-          <w:t xml:space="preserve">1. CIS Controls v8.1 Foundations [7](#cis-controls-v8.1-foundations)</w:t>
-        </w:r>
-      </w:hyperlink>
-    </w:p>
-    <w:p>
-      <w:pPr>
-        <w:pStyle w:val="BodyText"/>
-      </w:pPr>
-      <w:hyperlink w:anchor="implementation-groups-and-prioritization">
-        <w:r>
-          <w:rPr>
-            <w:rStyle w:val="Hyperlink"/>
-          </w:rPr>
-          <w:t xml:space="preserve">2. Grupos de aplicación y prioridades [8](#implementation-groups-and-prioritization)</w:t>
-        </w:r>
-      </w:hyperlink>
-    </w:p>
-    <w:p>
-      <w:pPr>
-        <w:pStyle w:val="BodyText"/>
-      </w:pPr>
-      <w:hyperlink w:anchor="governance-scope-and-ownership">
-        <w:r>
-          <w:rPr>
-            <w:rStyle w:val="Hyperlink"/>
-          </w:rPr>
-          <w:t xml:space="preserve">3. Gobernanza, alcance y propiedad [9](#governance-scope-and-ownership)</w:t>
-        </w:r>
-      </w:hyperlink>
-    </w:p>
-    <w:p>
-      <w:pPr>
-        <w:pStyle w:val="BodyText"/>
-      </w:pPr>
-      <w:hyperlink w:anchor="Xbf3924bf8cf932d25fff63d7863e0f18b56dc49">
-        <w:r>
-          <w:rPr>
-            <w:rStyle w:val="Hyperlink"/>
-          </w:rPr>
-          <w:t xml:space="preserve">4. Medición con la Evaluación de CIS Especificación [10](#measurement-with-the-cis-assessment-specification)</w:t>
-        </w:r>
-      </w:hyperlink>
-    </w:p>
-    <w:p>
-      <w:pPr>
-        <w:pStyle w:val="BodyText"/>
-      </w:pPr>
-      <w:hyperlink w:anchor="implementation-roadmap">
-        <w:r>
-          <w:rPr>
-            <w:rStyle w:val="Hyperlink"/>
-          </w:rPr>
-          <w:t xml:space="preserve">5. Implementation Roadmap [11](#implementation-roadmap)</w:t>
-        </w:r>
-      </w:hyperlink>
-    </w:p>
-    <w:p>
-      <w:pPr>
-        <w:pStyle w:val="BodyText"/>
-      </w:pPr>
-      <w:hyperlink w:anchor="Xcb905b754d5b3fc518484cc33ef0e68fd88528b">
-        <w:r>
-          <w:rPr>
-            <w:rStyle w:val="Hyperlink"/>
-          </w:rPr>
-          <w:t xml:space="preserve">6. Control 1 - Inventario y Control de Activos Empresarios [12](#control-1-inventory-and-control-of-enterprise-assets)</w:t>
-        </w:r>
-      </w:hyperlink>
-    </w:p>
-    <w:p>
-      <w:pPr>
-        <w:pStyle w:val="BodyText"/>
-      </w:pPr>
-      <w:hyperlink w:anchor="X37956519be140f8819326ca191a7b0b5dac97d7">
-        <w:r>
-          <w:rPr>
-            <w:rStyle w:val="Hyperlink"/>
-          </w:rPr>
-          <w:t xml:space="preserve">7. Control 2 — Inventario y control de activos de software [13](#control-2-inventory-and-control-of-software-assets)</w:t>
-        </w:r>
-      </w:hyperlink>
-    </w:p>
-    <w:p>
-      <w:pPr>
-        <w:pStyle w:val="BodyText"/>
-      </w:pPr>
-      <w:hyperlink w:anchor="control-3-data-protection">
-        <w:r>
-          <w:rPr>
-            <w:rStyle w:val="Hyperlink"/>
-          </w:rPr>
-          <w:t xml:space="preserve">8. Control 3 — Data Protection [14](#control-3-data-protection)</w:t>
-        </w:r>
-      </w:hyperlink>
-    </w:p>
-    <w:p>
-      <w:pPr>
-        <w:pStyle w:val="BodyText"/>
-      </w:pPr>
-      <w:hyperlink w:anchor="X1f8ac71b523efde6c301607dbc3b8be7dc7da65">
-        <w:r>
-          <w:rPr>
-            <w:rStyle w:val="Hyperlink"/>
-          </w:rPr>
-          <w:t xml:space="preserve">9. Control 4 — Configuración segura de activos y software de la empresa [16](#control-4-secure-configuration-of-enterprise-assets-and-software)</w:t>
-        </w:r>
-      </w:hyperlink>
-    </w:p>
-    <w:p>
-      <w:pPr>
-        <w:pStyle w:val="BodyText"/>
-      </w:pPr>
-      <w:hyperlink w:anchor="control-5-account-management">
-        <w:r>
-          <w:rPr>
-            <w:rStyle w:val="Hyperlink"/>
-          </w:rPr>
-          <w:t xml:space="preserve">10. Control 5 — Account Management [18](#control-5-account-management)</w:t>
-        </w:r>
-      </w:hyperlink>
-    </w:p>
-    <w:p>
-      <w:pPr>
-        <w:pStyle w:val="BodyText"/>
-      </w:pPr>
-      <w:hyperlink w:anchor="control-6-access-control-management">
-        <w:r>
-          <w:rPr>
-            <w:rStyle w:val="Hyperlink"/>
-          </w:rPr>
-          <w:t xml:space="preserve">11. Control 6 — Access Control Management [19](#control-6-access-control-management)</w:t>
-        </w:r>
-      </w:hyperlink>
-    </w:p>
-    <w:p>
-      <w:pPr>
-        <w:pStyle w:val="BodyText"/>
-      </w:pPr>
-      <w:hyperlink w:anchor="X6aa7aa662c4cef37250530fa9e87c30ae468952">
-        <w:r>
-          <w:rPr>
-            <w:rStyle w:val="Hyperlink"/>
-          </w:rPr>
-          <w:t xml:space="preserve">12. Control 7 - Gestión continua de la vulnerabilidad [21](#control-7-continuous-vulnerability-management)</w:t>
-        </w:r>
-      </w:hyperlink>
-    </w:p>
-    <w:p>
-      <w:pPr>
-        <w:pStyle w:val="BodyText"/>
-      </w:pPr>
-      <w:hyperlink w:anchor="control-8-audit-log-management">
-        <w:r>
-          <w:rPr>
-            <w:rStyle w:val="Hyperlink"/>
-          </w:rPr>
-          <w:t xml:space="preserve">13. Control 8 — Audit Log Management [23](#control-8-audit-log-management)</w:t>
-        </w:r>
-      </w:hyperlink>
-    </w:p>
-    <w:p>
-      <w:pPr>
-        <w:pStyle w:val="BodyText"/>
-      </w:pPr>
-      <w:hyperlink w:anchor="X791d7a48cfae6ee35ec03e49d25cc37606e6fcb">
-        <w:r>
-          <w:rPr>
-            <w:rStyle w:val="Hyperlink"/>
-          </w:rPr>
-          <w:t xml:space="preserve">14. Control 9 — Email and Web Browser Protections [24](#control-9-email-and-web-browser-protections)</w:t>
-        </w:r>
-      </w:hyperlink>
-    </w:p>
-    <w:p>
-      <w:pPr>
-        <w:pStyle w:val="BodyText"/>
-      </w:pPr>
-      <w:hyperlink w:anchor="control-10-malware-defenses">
-        <w:r>
-          <w:rPr>
-            <w:rStyle w:val="Hyperlink"/>
-          </w:rPr>
-          <w:t xml:space="preserve">15. Control 10 — Malware Defenses [25](#control-10-malware-defenses)</w:t>
-        </w:r>
-      </w:hyperlink>
-    </w:p>
-    <w:p>
-      <w:pPr>
-        <w:pStyle w:val="BodyText"/>
-      </w:pPr>
-      <w:hyperlink w:anchor="control-11-data-recovery">
-        <w:r>
-          <w:rPr>
-            <w:rStyle w:val="Hyperlink"/>
-          </w:rPr>
-          <w:t xml:space="preserve">16. Control 11 — Data Recovery [26](#control-11-data-recovery)</w:t>
-        </w:r>
-      </w:hyperlink>
-    </w:p>
-    <w:p>
-      <w:pPr>
-        <w:pStyle w:val="BodyText"/>
-      </w:pPr>
-      <w:hyperlink w:anchor="X891e0655540f271c3a6629f29eea3dad08d94f6">
-        <w:r>
-          <w:rPr>
-            <w:rStyle w:val="Hyperlink"/>
-          </w:rPr>
-          <w:t xml:space="preserve">17. Control 12 — Network Infrastructure Management [27](#control-12-network-infrastructure-management)</w:t>
-        </w:r>
-      </w:hyperlink>
-    </w:p>
-    <w:p>
-      <w:pPr>
-        <w:pStyle w:val="BodyText"/>
-      </w:pPr>
-      <w:hyperlink w:anchor="X70229194786b2abc2dfe755a6454a63b37ad7a9">
-        <w:r>
-          <w:rPr>
-            <w:rStyle w:val="Hyperlink"/>
-          </w:rPr>
-          <w:t xml:space="preserve">18. Control 13 — Network Monitoring and Defense [28](#control-13-network-monitoring-and-defense)</w:t>
-        </w:r>
-      </w:hyperlink>
-    </w:p>
-    <w:p>
-      <w:pPr>
-        <w:pStyle w:val="BodyText"/>
-      </w:pPr>
-      <w:hyperlink w:anchor="Xb079703dfd4ce592406be53f1ae423c569da4c7">
-        <w:r>
-          <w:rPr>
-            <w:rStyle w:val="Hyperlink"/>
-          </w:rPr>
-          <w:t xml:space="preserve">19. Control 14 — Security Awareness and Skills Training [30](#control-14-security-awareness-and-skills-training)</w:t>
-        </w:r>
-      </w:hyperlink>
-    </w:p>
-    <w:p>
-      <w:pPr>
-        <w:pStyle w:val="BodyText"/>
-      </w:pPr>
-      <w:hyperlink w:anchor="control-15-service-provider-management">
-        <w:r>
-          <w:rPr>
-            <w:rStyle w:val="Hyperlink"/>
-          </w:rPr>
-          <w:t xml:space="preserve">20. Control 15 — Service Provider Management [31](#control-15-service-provider-management)</w:t>
-        </w:r>
-      </w:hyperlink>
-    </w:p>
-    <w:p>
-      <w:pPr>
-        <w:pStyle w:val="BodyText"/>
-      </w:pPr>
-      <w:hyperlink w:anchor="control-16-application-software-security">
-        <w:r>
-          <w:rPr>
-            <w:rStyle w:val="Hyperlink"/>
-          </w:rPr>
-          <w:t xml:space="preserve">21. Control 16 — Application Software Security [32](#control-16-application-software-security)</w:t>
-        </w:r>
-      </w:hyperlink>
-    </w:p>
-    <w:p>
-      <w:pPr>
-        <w:pStyle w:val="BodyText"/>
-      </w:pPr>
-      <w:hyperlink w:anchor="control-17-incident-response-management">
-        <w:r>
-          <w:rPr>
-            <w:rStyle w:val="Hyperlink"/>
-          </w:rPr>
-          <w:t xml:space="preserve">22. Control 17 — Gestión de la respuesta de incidentes [34] (#control-17-incident-response-management)</w:t>
-        </w:r>
-      </w:hyperlink>
-    </w:p>
-    <w:p>
-      <w:pPr>
-        <w:pStyle w:val="BodyText"/>
-      </w:pPr>
-      <w:hyperlink w:anchor="control-18-penetration-testing">
-        <w:r>
-          <w:rPr>
-            <w:rStyle w:val="Hyperlink"/>
-          </w:rPr>
-          <w:t xml:space="preserve">23. Control 18 — Penetration Testing [36](#control-18-penetration-testing)</w:t>
-        </w:r>
-      </w:hyperlink>
-    </w:p>
-    <w:p>
-      <w:pPr>
-        <w:pStyle w:val="BodyText"/>
-      </w:pPr>
-      <w:hyperlink w:anchor="open-source-tools">
-        <w:r>
-          <w:rPr>
-            <w:rStyle w:val="Hyperlink"/>
-          </w:rPr>
-          <w:t xml:space="preserve">24. Open-Source Tools [37](#open-source-tools)</w:t>
-        </w:r>
-      </w:hyperlink>
-    </w:p>
-    <w:p>
-      <w:pPr>
-        <w:pStyle w:val="BodyText"/>
-      </w:pPr>
-      <w:hyperlink w:anchor="cis-controls-navigator">
-        <w:r>
-          <w:rPr>
-            <w:rStyle w:val="Hyperlink"/>
-          </w:rPr>
-          <w:t xml:space="preserve">24.1 CIS Controls Navigator [37](#cis-controls-navigator)</w:t>
-        </w:r>
-      </w:hyperlink>
-    </w:p>
-    <w:p>
-      <w:pPr>
-        <w:pStyle w:val="BodyText"/>
-      </w:pPr>
-      <w:hyperlink w:anchor="cis-controls-assessment-specification">
-        <w:r>
-          <w:rPr>
-            <w:rStyle w:val="Hyperlink"/>
-          </w:rPr>
-          <w:t xml:space="preserve">24.2 CIS Controls Assessment Specification [37](#cis-controls-assessment-specification)</w:t>
-        </w:r>
-      </w:hyperlink>
-    </w:p>
-    <w:p>
-      <w:pPr>
-        <w:pStyle w:val="BodyText"/>
-      </w:pPr>
-      <w:hyperlink w:anchor="cis-cat-lite">
-        <w:r>
-          <w:rPr>
-            <w:rStyle w:val="Hyperlink"/>
-          </w:rPr>
-          <w:t xml:space="preserve">24.3 CIS-CAT Lite [37](#cis-cat-lite)</w:t>
-        </w:r>
-      </w:hyperlink>
-    </w:p>
-    <w:p>
-      <w:pPr>
-        <w:pStyle w:val="BodyText"/>
-      </w:pPr>
-      <w:hyperlink w:anchor="ciso-assistant">
-        <w:r>
-          <w:rPr>
-            <w:rStyle w:val="Hyperlink"/>
-          </w:rPr>
-          <w:t xml:space="preserve">24.4 CISO Assistant [38](#ciso-assistant)</w:t>
-        </w:r>
-      </w:hyperlink>
-    </w:p>
-    <w:p>
-      <w:pPr>
-        <w:pStyle w:val="BodyText"/>
-      </w:pPr>
-      <w:hyperlink w:anchor="wazuh">
-        <w:r>
-          <w:rPr>
-            <w:rStyle w:val="Hyperlink"/>
-          </w:rPr>
-          <w:t xml:space="preserve">24.5 Wazuh [38](#wazuh)</w:t>
-        </w:r>
-      </w:hyperlink>
-    </w:p>
-    <w:p>
-      <w:pPr>
-        <w:pStyle w:val="BodyText"/>
-      </w:pPr>
-      <w:hyperlink w:anchor="osquery">
-        <w:r>
-          <w:rPr>
-            <w:rStyle w:val="Hyperlink"/>
-          </w:rPr>
-          <w:t xml:space="preserve">24.6 osquery [38](#osquery)</w:t>
-        </w:r>
-      </w:hyperlink>
-    </w:p>
-    <w:p>
-      <w:pPr>
-        <w:pStyle w:val="BodyText"/>
-      </w:pPr>
-      <w:hyperlink w:anchor="openscap">
-        <w:r>
-          <w:rPr>
-            <w:rStyle w:val="Hyperlink"/>
-          </w:rPr>
-          <w:t xml:space="preserve">24.7 OpenSCAP [38](#openscap)</w:t>
-        </w:r>
-      </w:hyperlink>
-    </w:p>
-    <w:p>
-      <w:pPr>
-        <w:pStyle w:val="BodyText"/>
-      </w:pPr>
-      <w:hyperlink w:anchor="lynis">
-        <w:r>
-          <w:rPr>
-            <w:rStyle w:val="Hyperlink"/>
-          </w:rPr>
-          <w:t xml:space="preserve">24.8 Lynis [38](#lynis)</w:t>
-        </w:r>
-      </w:hyperlink>
-    </w:p>
-    <w:p>
-      <w:pPr>
-        <w:pStyle w:val="BodyText"/>
-      </w:pPr>
-      <w:hyperlink w:anchor="nmap">
-        <w:r>
-          <w:rPr>
-            <w:rStyle w:val="Hyperlink"/>
-          </w:rPr>
-          <w:t xml:space="preserve">24.9 Nmap [39](#nmap)</w:t>
-        </w:r>
-      </w:hyperlink>
-    </w:p>
-    <w:p>
-      <w:pPr>
-        <w:pStyle w:val="BodyText"/>
-      </w:pPr>
-      <w:hyperlink w:anchor="greenbone-community-edition">
-        <w:r>
-          <w:rPr>
-            <w:rStyle w:val="Hyperlink"/>
-          </w:rPr>
-          <w:t xml:space="preserve">24.10 Greenbone Community Edition [39](#greenbone-community-edition)</w:t>
-        </w:r>
-      </w:hyperlink>
-    </w:p>
-    <w:p>
-      <w:pPr>
-        <w:pStyle w:val="BodyText"/>
-      </w:pPr>
-      <w:hyperlink w:anchor="trivy">
-        <w:r>
-          <w:rPr>
-            <w:rStyle w:val="Hyperlink"/>
-          </w:rPr>
-          <w:t xml:space="preserve">24.11 Trivy [39](#trivy)</w:t>
-        </w:r>
-      </w:hyperlink>
-    </w:p>
-    <w:p>
-      <w:pPr>
-        <w:pStyle w:val="BodyText"/>
-      </w:pPr>
-      <w:hyperlink w:anchor="owasp-zap">
-        <w:r>
-          <w:rPr>
-            <w:rStyle w:val="Hyperlink"/>
-          </w:rPr>
-          <w:t xml:space="preserve">24.12 OWASP ZAP [39](#owasp-zap)</w:t>
-        </w:r>
-      </w:hyperlink>
-    </w:p>
-    <w:p>
-      <w:pPr>
-        <w:pStyle w:val="BodyText"/>
-      </w:pPr>
-      <w:hyperlink w:anchor="suricata">
-        <w:r>
-          <w:rPr>
-            <w:rStyle w:val="Hyperlink"/>
-          </w:rPr>
-          <w:t xml:space="preserve">24.13 Suricata [39](#suricata)</w:t>
-        </w:r>
-      </w:hyperlink>
-    </w:p>
-    <w:p>
-      <w:pPr>
-        <w:pStyle w:val="BodyText"/>
-      </w:pPr>
-      <w:hyperlink w:anchor="keycloak">
-        <w:r>
-          <w:rPr>
-            <w:rStyle w:val="Hyperlink"/>
-          </w:rPr>
-          <w:t xml:space="preserve">24.14 Keycloak [39](#keycloak)</w:t>
-        </w:r>
-      </w:hyperlink>
-    </w:p>
-    <w:p>
-      <w:pPr>
-        <w:pStyle w:val="BodyText"/>
-      </w:pPr>
-      <w:hyperlink w:anchor="defectdojo">
-        <w:r>
-          <w:rPr>
-            <w:rStyle w:val="Hyperlink"/>
-          </w:rPr>
-          <w:t xml:space="preserve">24.15 DefectDojo [40](#defectdojo)</w:t>
-        </w:r>
-      </w:hyperlink>
-    </w:p>
-    <w:p>
-      <w:pPr>
-        <w:pStyle w:val="BodyText"/>
-      </w:pPr>
-      <w:hyperlink w:anchor="velociraptor">
-        <w:r>
-          <w:rPr>
-            <w:rStyle w:val="Hyperlink"/>
-          </w:rPr>
-          <w:t xml:space="preserve">24.16 Velociraptor [40](#velociraptor)</w:t>
-        </w:r>
-      </w:hyperlink>
-    </w:p>
-    <w:p>
-      <w:pPr>
-        <w:pStyle w:val="BodyText"/>
-      </w:pPr>
-      <w:hyperlink w:anchor="managers-cis-controls-playbook">
-        <w:r>
-          <w:rPr>
-            <w:rStyle w:val="Hyperlink"/>
-          </w:rPr>
-          <w:t xml:space="preserve">25. Manual de los Controles CIS para gerentes [41](#managers-cis-controls-playbook)</w:t>
-        </w:r>
-      </w:hyperlink>
-    </w:p>
-    <w:p>
-      <w:pPr>
-        <w:pStyle w:val="BodyText"/>
-      </w:pPr>
-      <w:hyperlink w:anchor="junior-analyst-career-guide">
-        <w:r>
-          <w:rPr>
-            <w:rStyle w:val="Hyperlink"/>
-          </w:rPr>
-          <w:t xml:space="preserve">26. Guía de la carrera de analista junior [42](#junior-analyst-career-guide)</w:t>
-        </w:r>
-      </w:hyperlink>
-    </w:p>
-    <w:p>
-      <w:pPr>
-        <w:pStyle w:val="BodyText"/>
-      </w:pPr>
-      <w:hyperlink w:anchor="typical-junior-work">
-        <w:r>
-          <w:rPr>
-            <w:rStyle w:val="Hyperlink"/>
-          </w:rPr>
-          <w:t xml:space="preserve">26.1 Trabajo junior típico [42](#typical-junior-work)</w:t>
-        </w:r>
-      </w:hyperlink>
-    </w:p>
-    <w:p>
-      <w:pPr>
-        <w:pStyle w:val="BodyText"/>
-      </w:pPr>
-      <w:hyperlink w:anchor="fictional-laboratory-and-portfolio">
-        <w:r>
-          <w:rPr>
-            <w:rStyle w:val="Hyperlink"/>
-          </w:rPr>
-          <w:t xml:space="preserve">27. Laboratorio de Ficción y Cartera [44](#fictional-laboratory-and-portfolio)</w:t>
-        </w:r>
-      </w:hyperlink>
-    </w:p>
-    <w:p>
-      <w:pPr>
-        <w:pStyle w:val="BodyText"/>
-      </w:pPr>
-      <w:hyperlink w:anchor="thirty-day-learning-plan">
-        <w:r>
-          <w:rPr>
-            <w:rStyle w:val="Hyperlink"/>
-          </w:rPr>
-          <w:t xml:space="preserve">28. Plan de aprendizaje de 30 días [45] (#thirty-day-learning-plan)</w:t>
-        </w:r>
-      </w:hyperlink>
-    </w:p>
-    <w:p>
-      <w:pPr>
-        <w:pStyle w:val="BodyText"/>
-      </w:pPr>
-      <w:hyperlink w:anchor="interview-preparation">
-        <w:r>
-          <w:rPr>
-            <w:rStyle w:val="Hyperlink"/>
-          </w:rPr>
-          <w:t xml:space="preserve">29. Preparación de entrevistas [46](#interview-preparation)</w:t>
-        </w:r>
-      </w:hyperlink>
-    </w:p>
-    <w:p>
-      <w:pPr>
-        <w:pStyle w:val="BodyText"/>
-      </w:pPr>
-      <w:hyperlink w:anchor="what-are-the-cis-controls">
-        <w:r>
-          <w:rPr>
-            <w:rStyle w:val="Hyperlink"/>
-          </w:rPr>
-          <w:t xml:space="preserve">29.1 ¿Cuáles son los controles CIS? [46](#what-are-the-cis-controls)</w:t>
-        </w:r>
-      </w:hyperlink>
-    </w:p>
-    <w:p>
-      <w:pPr>
-        <w:pStyle w:val="BodyText"/>
-      </w:pPr>
-      <w:hyperlink w:anchor="what-is-ig1">
-        <w:r>
-          <w:rPr>
-            <w:rStyle w:val="Hyperlink"/>
-          </w:rPr>
-          <w:t xml:space="preserve">29.2 ¿Qué es IG1? [46](#what-is-ig1)</w:t>
-        </w:r>
-      </w:hyperlink>
-    </w:p>
-    <w:p>
-      <w:pPr>
-        <w:pStyle w:val="BodyText"/>
-      </w:pPr>
-      <w:hyperlink w:anchor="does-ig1-fit-every-requirement">
-        <w:r>
-          <w:rPr>
-            <w:rStyle w:val="Hyperlink"/>
-          </w:rPr>
-          <w:t xml:space="preserve">29.3 ¿Se ajusta IG1 a cada requisito? [46](#does-ig1-fit-every-requirement)</w:t>
-        </w:r>
-      </w:hyperlink>
-    </w:p>
-    <w:p>
-      <w:pPr>
-        <w:pStyle w:val="BodyText"/>
-      </w:pPr>
-      <w:hyperlink w:anchor="how-do-you-measure-a-safeguard">
-        <w:r>
-          <w:rPr>
-            <w:rStyle w:val="Hyperlink"/>
-          </w:rPr>
-          <w:t xml:space="preserve">29.4 ¿Cómo mide una Salvaguardia? [46](#how-do-you-measure-a-safeguard)</w:t>
-        </w:r>
-      </w:hyperlink>
-    </w:p>
-    <w:p>
-      <w:pPr>
-        <w:pStyle w:val="BodyText"/>
-      </w:pPr>
-      <w:hyperlink w:anchor="why-are-inventories-important">
-        <w:r>
-          <w:rPr>
-            <w:rStyle w:val="Hyperlink"/>
-          </w:rPr>
-          <w:t xml:space="preserve">29.5 ¿Por qué son importantes los inventarios? [46](#why-are-inventories-important)</w:t>
-        </w:r>
-      </w:hyperlink>
-    </w:p>
-    <w:p>
-      <w:pPr>
-        <w:pStyle w:val="BodyText"/>
-      </w:pPr>
-      <w:hyperlink w:anchor="Xe496931795d3c2c579a2f694457ec81aab2623f">
-        <w:r>
-          <w:rPr>
-            <w:rStyle w:val="Hyperlink"/>
-          </w:rPr>
-          <w:t xml:space="preserve">29.6 Vulnerability scan versus penetración test? [46](#vulnerability-scan-versus-penetration-test)</w:t>
-        </w:r>
-      </w:hyperlink>
-    </w:p>
-    <w:p>
-      <w:pPr>
-        <w:pStyle w:val="BodyText"/>
-      </w:pPr>
-      <w:hyperlink w:anchor="X1c47685cc75c258d8e077fdbf935fe97d64cfe1">
-        <w:r>
-          <w:rPr>
-            <w:rStyle w:val="Hyperlink"/>
-          </w:rPr>
-          <w:t xml:space="preserve">29.7 ¿Una asignación marco demuestra el cumplimiento? [46](#does-a-framework-mapping-prove-compliance)</w:t>
-        </w:r>
-      </w:hyperlink>
-    </w:p>
-    <w:p>
-      <w:pPr>
-        <w:pStyle w:val="BodyText"/>
-      </w:pPr>
-      <w:hyperlink w:anchor="what-can-a-junior-analyst-conclude">
-        <w:r>
-          <w:rPr>
-            <w:rStyle w:val="Hyperlink"/>
-          </w:rPr>
-          <w:t xml:space="preserve">29.8 ¿Qué puede concluir un analista junior? [46](#what-can-a-junior-analyst-conclude)</w:t>
-        </w:r>
-      </w:hyperlink>
-    </w:p>
-    <w:p>
-      <w:pPr>
-        <w:pStyle w:val="BodyText"/>
-      </w:pPr>
-      <w:hyperlink w:anchor="questions-to-ask-the-employer">
-        <w:r>
-          <w:rPr>
-            <w:rStyle w:val="Hyperlink"/>
-          </w:rPr>
-          <w:t xml:space="preserve">29.9 Preguntas para hacer al empleador [46](#questions-to-ask-the-employer)</w:t>
-        </w:r>
-      </w:hyperlink>
-    </w:p>
-    <w:p>
-      <w:pPr>
-        <w:pStyle w:val="BodyText"/>
-      </w:pPr>
-      <w:hyperlink w:anchor="templates-glossary-index-and-references">
-        <w:r>
-          <w:rPr>
-            <w:rStyle w:val="Hyperlink"/>
-          </w:rPr>
-          <w:t xml:space="preserve">30. Plantillas, Glosario, Índice y Referencias [48](#templates-glossary-index-and-references)</w:t>
-        </w:r>
-      </w:hyperlink>
-    </w:p>
-    <w:p>
-      <w:pPr>
-        <w:pStyle w:val="BodyText"/>
-      </w:pPr>
-      <w:hyperlink w:anchor="safeguard-measurement-workpaper">
-        <w:r>
-          <w:rPr>
-            <w:rStyle w:val="Hyperlink"/>
-          </w:rPr>
-          <w:t xml:space="preserve">30.1 Documentos de trabajo de medición de seguridad [48](#safeguard-measurement-workpaper)</w:t>
-        </w:r>
-      </w:hyperlink>
-    </w:p>
-    <w:p>
-      <w:pPr>
-        <w:pStyle w:val="BodyText"/>
-      </w:pPr>
-      <w:hyperlink w:anchor="finding-and-retest-record">
-        <w:r>
-          <w:rPr>
-            <w:rStyle w:val="Hyperlink"/>
-          </w:rPr>
-          <w:t xml:space="preserve">30.2 Registro de hallazgos y nuevas pruebas [48](#finding-and-retest-record)</w:t>
-        </w:r>
-      </w:hyperlink>
-    </w:p>
-    <w:p>
-      <w:pPr>
-        <w:pStyle w:val="BodyText"/>
-      </w:pPr>
-      <w:hyperlink w:anchor="glossary">
-        <w:r>
-          <w:rPr>
-            <w:rStyle w:val="Hyperlink"/>
-          </w:rPr>
-          <w:t xml:space="preserve">30.3 Glosario [48](#glossary)</w:t>
-        </w:r>
-      </w:hyperlink>
-    </w:p>
-    <w:p>
-      <w:pPr>
-        <w:pStyle w:val="BodyText"/>
-      </w:pPr>
-      <w:hyperlink w:anchor="subject-index">
-        <w:r>
-          <w:rPr>
-            <w:rStyle w:val="Hyperlink"/>
-          </w:rPr>
-          <w:t xml:space="preserve">30.4 Índice de asunto [49](#subject-index)</w:t>
-        </w:r>
-      </w:hyperlink>
-    </w:p>
-    <w:p>
-      <w:pPr>
-        <w:pStyle w:val="BodyText"/>
-      </w:pPr>
-      <w:hyperlink w:anchor="official-references">
-        <w:r>
-          <w:rPr>
-            <w:rStyle w:val="Hyperlink"/>
-          </w:rPr>
-          <w:t xml:space="preserve">30.5 Referencias oficiales [49](#official-references)</w:t>
-        </w:r>
-      </w:hyperlink>
-    </w:p>
-    <w:bookmarkEnd w:id="23"/>
-    <w:bookmarkStart w:id="24" w:name="fundamentos-de-cis-controls-v8.1"/>
+        <w:numPr>
+          <w:ilvl w:val="0"/>
+          <w:numId w:val="1002"/>
+        </w:numPr>
+        <w:pStyle w:val="Compact"/>
+      </w:pPr>
+      <w:r>
+        <w:t xml:space="preserve">Fundamentos de CIS Controls v8.1</w:t>
+      </w:r>
+      <w:r>
+        <w:br/>
+      </w:r>
+    </w:p>
+    <w:p>
+      <w:pPr>
+        <w:numPr>
+          <w:ilvl w:val="0"/>
+          <w:numId w:val="1002"/>
+        </w:numPr>
+        <w:pStyle w:val="Compact"/>
+      </w:pPr>
+      <w:r>
+        <w:t xml:space="preserve">Grupos de Implementación y priorización</w:t>
+      </w:r>
+      <w:r>
+        <w:br/>
+      </w:r>
+    </w:p>
+    <w:p>
+      <w:pPr>
+        <w:numPr>
+          <w:ilvl w:val="0"/>
+          <w:numId w:val="1002"/>
+        </w:numPr>
+        <w:pStyle w:val="Compact"/>
+      </w:pPr>
+      <w:r>
+        <w:t xml:space="preserve">Gobernanza, alcance y responsabilidades</w:t>
+      </w:r>
+      <w:r>
+        <w:br/>
+      </w:r>
+    </w:p>
+    <w:p>
+      <w:pPr>
+        <w:numPr>
+          <w:ilvl w:val="0"/>
+          <w:numId w:val="1002"/>
+        </w:numPr>
+        <w:pStyle w:val="Compact"/>
+      </w:pPr>
+      <w:r>
+        <w:t xml:space="preserve">Medición con la Especificación para la Evaluación de Controles de CIS</w:t>
+      </w:r>
+      <w:r>
+        <w:br/>
+      </w:r>
+    </w:p>
+    <w:p>
+      <w:pPr>
+        <w:numPr>
+          <w:ilvl w:val="0"/>
+          <w:numId w:val="1002"/>
+        </w:numPr>
+        <w:pStyle w:val="Compact"/>
+      </w:pPr>
+      <w:r>
+        <w:t xml:space="preserve">Hoja de ruta de implementación</w:t>
+      </w:r>
+      <w:r>
+        <w:br/>
+      </w:r>
+      <w:r>
+        <w:t xml:space="preserve">6–23. Los 18 CIS Controls</w:t>
+      </w:r>
+      <w:r>
+        <w:br/>
+      </w:r>
+    </w:p>
+    <w:p>
+      <w:pPr>
+        <w:numPr>
+          <w:ilvl w:val="0"/>
+          <w:numId w:val="1002"/>
+        </w:numPr>
+        <w:pStyle w:val="Compact"/>
+      </w:pPr>
+      <w:r>
+        <w:t xml:space="preserve">Herramientas de código abierto</w:t>
+      </w:r>
+      <w:r>
+        <w:br/>
+      </w:r>
+    </w:p>
+    <w:p>
+      <w:pPr>
+        <w:numPr>
+          <w:ilvl w:val="0"/>
+          <w:numId w:val="1002"/>
+        </w:numPr>
+        <w:pStyle w:val="Compact"/>
+      </w:pPr>
+      <w:r>
+        <w:t xml:space="preserve">Guía de CIS Controls para gestores</w:t>
+      </w:r>
+      <w:r>
+        <w:br/>
+      </w:r>
+    </w:p>
+    <w:p>
+      <w:pPr>
+        <w:numPr>
+          <w:ilvl w:val="0"/>
+          <w:numId w:val="1002"/>
+        </w:numPr>
+        <w:pStyle w:val="Compact"/>
+      </w:pPr>
+      <w:r>
+        <w:t xml:space="preserve">Guía profesional para analistas júnior</w:t>
+      </w:r>
+      <w:r>
+        <w:br/>
+      </w:r>
+    </w:p>
+    <w:p>
+      <w:pPr>
+        <w:numPr>
+          <w:ilvl w:val="0"/>
+          <w:numId w:val="1002"/>
+        </w:numPr>
+        <w:pStyle w:val="Compact"/>
+      </w:pPr>
+      <w:r>
+        <w:t xml:space="preserve">Laboratorio ficticio y portafolio</w:t>
+      </w:r>
+      <w:r>
+        <w:br/>
+      </w:r>
+    </w:p>
+    <w:p>
+      <w:pPr>
+        <w:numPr>
+          <w:ilvl w:val="0"/>
+          <w:numId w:val="1002"/>
+        </w:numPr>
+        <w:pStyle w:val="Compact"/>
+      </w:pPr>
+      <w:r>
+        <w:t xml:space="preserve">Plan de aprendizaje de treinta días</w:t>
+      </w:r>
+      <w:r>
+        <w:br/>
+      </w:r>
+    </w:p>
+    <w:p>
+      <w:pPr>
+        <w:numPr>
+          <w:ilvl w:val="0"/>
+          <w:numId w:val="1002"/>
+        </w:numPr>
+        <w:pStyle w:val="Compact"/>
+      </w:pPr>
+      <w:r>
+        <w:t xml:space="preserve">Preparación para entrevistas</w:t>
+      </w:r>
+      <w:r>
+        <w:br/>
+      </w:r>
+    </w:p>
+    <w:p>
+      <w:pPr>
+        <w:numPr>
+          <w:ilvl w:val="0"/>
+          <w:numId w:val="1002"/>
+        </w:numPr>
+        <w:pStyle w:val="Compact"/>
+      </w:pPr>
+      <w:r>
+        <w:t xml:space="preserve">Plantillas, glosario, índice y referencias</w:t>
+      </w:r>
+    </w:p>
+    <w:bookmarkEnd w:id="24"/>
+    <w:bookmarkStart w:id="25" w:name="fundamentos-de-cis-controls-v8.1"/>
     <w:p>
       <w:pPr>
         <w:pStyle w:val="Heading1"/>
@@ -1254,7 +587,7 @@
       <w:pPr>
         <w:numPr>
           <w:ilvl w:val="0"/>
-          <w:numId w:val="1002"/>
+          <w:numId w:val="1003"/>
         </w:numPr>
       </w:pPr>
       <w:r>
@@ -1265,7 +598,7 @@
       <w:pPr>
         <w:numPr>
           <w:ilvl w:val="0"/>
-          <w:numId w:val="1002"/>
+          <w:numId w:val="1003"/>
         </w:numPr>
       </w:pPr>
       <w:r>
@@ -1276,7 +609,7 @@
       <w:pPr>
         <w:numPr>
           <w:ilvl w:val="0"/>
-          <w:numId w:val="1002"/>
+          <w:numId w:val="1003"/>
         </w:numPr>
       </w:pPr>
       <w:r>
@@ -1287,7 +620,7 @@
       <w:pPr>
         <w:numPr>
           <w:ilvl w:val="0"/>
-          <w:numId w:val="1002"/>
+          <w:numId w:val="1003"/>
         </w:numPr>
       </w:pPr>
       <w:r>
@@ -1298,7 +631,7 @@
       <w:pPr>
         <w:numPr>
           <w:ilvl w:val="0"/>
-          <w:numId w:val="1002"/>
+          <w:numId w:val="1003"/>
         </w:numPr>
       </w:pPr>
       <w:r>
@@ -1309,7 +642,7 @@
       <w:pPr>
         <w:numPr>
           <w:ilvl w:val="0"/>
-          <w:numId w:val="1002"/>
+          <w:numId w:val="1003"/>
         </w:numPr>
       </w:pPr>
       <w:r>
@@ -1521,8 +854,8 @@
         </w:tc>
       </w:tr>
     </w:tbl>
-    <w:bookmarkEnd w:id="24"/>
-    <w:bookmarkStart w:id="25" w:name="grupos-de-implementación-y-priorización"/>
+    <w:bookmarkEnd w:id="25"/>
+    <w:bookmarkStart w:id="26" w:name="grupos-de-implementación-y-priorización"/>
     <w:p>
       <w:pPr>
         <w:pStyle w:val="Heading1"/>
@@ -1821,7 +1154,7 @@
       <w:pPr>
         <w:numPr>
           <w:ilvl w:val="0"/>
-          <w:numId w:val="1003"/>
+          <w:numId w:val="1004"/>
         </w:numPr>
       </w:pPr>
       <w:r>
@@ -1832,7 +1165,7 @@
       <w:pPr>
         <w:numPr>
           <w:ilvl w:val="0"/>
-          <w:numId w:val="1003"/>
+          <w:numId w:val="1004"/>
         </w:numPr>
       </w:pPr>
       <w:r>
@@ -1843,7 +1176,7 @@
       <w:pPr>
         <w:numPr>
           <w:ilvl w:val="0"/>
-          <w:numId w:val="1003"/>
+          <w:numId w:val="1004"/>
         </w:numPr>
       </w:pPr>
       <w:r>
@@ -1854,7 +1187,7 @@
       <w:pPr>
         <w:numPr>
           <w:ilvl w:val="0"/>
-          <w:numId w:val="1003"/>
+          <w:numId w:val="1004"/>
         </w:numPr>
       </w:pPr>
       <w:r>
@@ -1865,15 +1198,15 @@
       <w:pPr>
         <w:numPr>
           <w:ilvl w:val="0"/>
-          <w:numId w:val="1003"/>
+          <w:numId w:val="1004"/>
         </w:numPr>
       </w:pPr>
       <w:r>
         <w:t xml:space="preserve">Utilice CIS Controls Navigator para filtrar las Salvaguardas de v8.1 y revisar las correspondencias oficiales.</w:t>
       </w:r>
     </w:p>
-    <w:bookmarkEnd w:id="25"/>
-    <w:bookmarkStart w:id="26" w:name="gobernanza-alcance-y-responsabilidades"/>
+    <w:bookmarkEnd w:id="26"/>
+    <w:bookmarkStart w:id="27" w:name="gobernanza-alcance-y-responsabilidades"/>
     <w:p>
       <w:pPr>
         <w:pStyle w:val="Heading1"/>
@@ -1898,7 +1231,7 @@
       <w:pPr>
         <w:numPr>
           <w:ilvl w:val="0"/>
-          <w:numId w:val="1004"/>
+          <w:numId w:val="1005"/>
         </w:numPr>
       </w:pPr>
       <w:r>
@@ -1909,7 +1242,7 @@
       <w:pPr>
         <w:numPr>
           <w:ilvl w:val="0"/>
-          <w:numId w:val="1004"/>
+          <w:numId w:val="1005"/>
         </w:numPr>
       </w:pPr>
       <w:r>
@@ -1920,7 +1253,7 @@
       <w:pPr>
         <w:numPr>
           <w:ilvl w:val="0"/>
-          <w:numId w:val="1004"/>
+          <w:numId w:val="1005"/>
         </w:numPr>
       </w:pPr>
       <w:r>
@@ -1931,7 +1264,7 @@
       <w:pPr>
         <w:numPr>
           <w:ilvl w:val="0"/>
-          <w:numId w:val="1004"/>
+          <w:numId w:val="1005"/>
         </w:numPr>
       </w:pPr>
       <w:r>
@@ -1942,7 +1275,7 @@
       <w:pPr>
         <w:numPr>
           <w:ilvl w:val="0"/>
-          <w:numId w:val="1004"/>
+          <w:numId w:val="1005"/>
         </w:numPr>
       </w:pPr>
       <w:r>
@@ -1953,7 +1286,7 @@
       <w:pPr>
         <w:numPr>
           <w:ilvl w:val="0"/>
-          <w:numId w:val="1004"/>
+          <w:numId w:val="1005"/>
         </w:numPr>
       </w:pPr>
       <w:r>
@@ -1964,7 +1297,7 @@
       <w:pPr>
         <w:numPr>
           <w:ilvl w:val="0"/>
-          <w:numId w:val="1004"/>
+          <w:numId w:val="1005"/>
         </w:numPr>
       </w:pPr>
       <w:r>
@@ -2228,8 +1561,8 @@
         </w:tc>
       </w:tr>
     </w:tbl>
-    <w:bookmarkEnd w:id="26"/>
-    <w:bookmarkStart w:id="30" w:name="X969040e64682a9e2ef1455f79db293094636c49"/>
+    <w:bookmarkEnd w:id="27"/>
+    <w:bookmarkStart w:id="31" w:name="X969040e64682a9e2ef1455f79db293094636c49"/>
     <w:p>
       <w:pPr>
         <w:pStyle w:val="Heading1"/>
@@ -2259,18 +1592,18 @@
           <wp:inline>
             <wp:extent cx="5334000" cy="2497753"/>
             <wp:effectExtent b="0" l="0" r="0" t="0"/>
-            <wp:docPr descr="La especificación oficial avanza desde entradas de datos definidas hasta operaciones, medidas, métricas y revisión de procedimientos." title="" id="28" name="Picture"/>
+            <wp:docPr descr="La especificación oficial avanza desde entradas de datos definidas hasta operaciones, medidas, métricas y revisión de procedimientos." title="" id="29" name="Picture"/>
             <a:graphic>
               <a:graphicData uri="http://schemas.openxmlformats.org/drawingml/2006/picture">
                 <pic:pic>
                   <pic:nvPicPr>
-                    <pic:cNvPr descr="media/image3.png" id="29" name="Picture"/>
+                    <pic:cNvPr descr="media/image3.png" id="30" name="Picture"/>
                     <pic:cNvPicPr>
                       <a:picLocks noChangeArrowheads="1" noChangeAspect="1"/>
                     </pic:cNvPicPr>
                   </pic:nvPicPr>
                   <pic:blipFill>
-                    <a:blip r:embed="rId27"/>
+                    <a:blip r:embed="rId28"/>
                     <a:stretch>
                       <a:fillRect/>
                     </a:stretch>
@@ -2574,7 +1907,7 @@
       <w:pPr>
         <w:numPr>
           <w:ilvl w:val="0"/>
-          <w:numId w:val="1005"/>
+          <w:numId w:val="1006"/>
         </w:numPr>
       </w:pPr>
       <w:r>
@@ -2585,7 +1918,7 @@
       <w:pPr>
         <w:numPr>
           <w:ilvl w:val="0"/>
-          <w:numId w:val="1005"/>
+          <w:numId w:val="1006"/>
         </w:numPr>
       </w:pPr>
       <w:r>
@@ -2596,7 +1929,7 @@
       <w:pPr>
         <w:numPr>
           <w:ilvl w:val="0"/>
-          <w:numId w:val="1005"/>
+          <w:numId w:val="1006"/>
         </w:numPr>
       </w:pPr>
       <w:r>
@@ -2607,7 +1940,7 @@
       <w:pPr>
         <w:numPr>
           <w:ilvl w:val="0"/>
-          <w:numId w:val="1005"/>
+          <w:numId w:val="1006"/>
         </w:numPr>
       </w:pPr>
       <w:r>
@@ -2618,7 +1951,7 @@
       <w:pPr>
         <w:numPr>
           <w:ilvl w:val="0"/>
-          <w:numId w:val="1005"/>
+          <w:numId w:val="1006"/>
         </w:numPr>
       </w:pPr>
       <w:r>
@@ -2629,7 +1962,7 @@
       <w:pPr>
         <w:numPr>
           <w:ilvl w:val="0"/>
-          <w:numId w:val="1005"/>
+          <w:numId w:val="1006"/>
         </w:numPr>
       </w:pPr>
       <w:r>
@@ -2640,7 +1973,7 @@
       <w:pPr>
         <w:numPr>
           <w:ilvl w:val="0"/>
-          <w:numId w:val="1005"/>
+          <w:numId w:val="1006"/>
         </w:numPr>
       </w:pPr>
       <w:r>
@@ -2651,15 +1984,15 @@
       <w:pPr>
         <w:numPr>
           <w:ilvl w:val="0"/>
-          <w:numId w:val="1005"/>
+          <w:numId w:val="1006"/>
         </w:numPr>
       </w:pPr>
       <w:r>
         <w:t xml:space="preserve">Informe alcance, resultado, excepción, limitación, responsable, acción y fecha.</w:t>
       </w:r>
     </w:p>
-    <w:bookmarkEnd w:id="30"/>
-    <w:bookmarkStart w:id="31" w:name="hoja-de-ruta-de-implementación"/>
+    <w:bookmarkEnd w:id="31"/>
+    <w:bookmarkStart w:id="32" w:name="hoja-de-ruta-de-implementación"/>
     <w:p>
       <w:pPr>
         <w:pStyle w:val="Heading1"/>
@@ -2684,7 +2017,7 @@
       <w:pPr>
         <w:numPr>
           <w:ilvl w:val="0"/>
-          <w:numId w:val="1006"/>
+          <w:numId w:val="1007"/>
         </w:numPr>
       </w:pPr>
       <w:r>
@@ -2695,7 +2028,7 @@
       <w:pPr>
         <w:numPr>
           <w:ilvl w:val="0"/>
-          <w:numId w:val="1006"/>
+          <w:numId w:val="1007"/>
         </w:numPr>
       </w:pPr>
       <w:r>
@@ -2706,7 +2039,7 @@
       <w:pPr>
         <w:numPr>
           <w:ilvl w:val="0"/>
-          <w:numId w:val="1006"/>
+          <w:numId w:val="1007"/>
         </w:numPr>
       </w:pPr>
       <w:r>
@@ -2717,7 +2050,7 @@
       <w:pPr>
         <w:numPr>
           <w:ilvl w:val="0"/>
-          <w:numId w:val="1006"/>
+          <w:numId w:val="1007"/>
         </w:numPr>
       </w:pPr>
       <w:r>
@@ -2728,7 +2061,7 @@
       <w:pPr>
         <w:numPr>
           <w:ilvl w:val="0"/>
-          <w:numId w:val="1006"/>
+          <w:numId w:val="1007"/>
         </w:numPr>
       </w:pPr>
       <w:r>
@@ -2739,7 +2072,7 @@
       <w:pPr>
         <w:numPr>
           <w:ilvl w:val="0"/>
-          <w:numId w:val="1006"/>
+          <w:numId w:val="1007"/>
         </w:numPr>
       </w:pPr>
       <w:r>
@@ -2750,7 +2083,7 @@
       <w:pPr>
         <w:numPr>
           <w:ilvl w:val="0"/>
-          <w:numId w:val="1006"/>
+          <w:numId w:val="1007"/>
         </w:numPr>
       </w:pPr>
       <w:r>
@@ -2761,7 +2094,7 @@
       <w:pPr>
         <w:numPr>
           <w:ilvl w:val="0"/>
-          <w:numId w:val="1006"/>
+          <w:numId w:val="1007"/>
         </w:numPr>
       </w:pPr>
       <w:r>
@@ -2772,7 +2105,7 @@
       <w:pPr>
         <w:numPr>
           <w:ilvl w:val="0"/>
-          <w:numId w:val="1006"/>
+          <w:numId w:val="1007"/>
         </w:numPr>
       </w:pPr>
       <w:r>
@@ -2817,8 +2150,8 @@
         </w:tc>
       </w:tr>
     </w:tbl>
-    <w:bookmarkEnd w:id="31"/>
-    <w:bookmarkStart w:id="32" w:name="Xbf3cbb637452d72ada0a90fc9fdf7319b4fed2d"/>
+    <w:bookmarkEnd w:id="32"/>
+    <w:bookmarkStart w:id="33" w:name="Xbf3cbb637452d72ada0a90fc9fdf7319b4fed2d"/>
     <w:p>
       <w:pPr>
         <w:pStyle w:val="Heading1"/>
@@ -3309,8 +2642,8 @@
         <w:t xml:space="preserve">Utilice la guía oficial de CIS Controls v8.1 y la Especificación de Evaluación de Controles para el lenguaje exacto, la clase de activo, la función de seguridad, el Grupo de Implementación, las dependencias, las entradas, las operaciones, las medidas, las métricas y la revisión de procedimientos.</w:t>
       </w:r>
     </w:p>
-    <w:bookmarkEnd w:id="32"/>
-    <w:bookmarkStart w:id="33" w:name="X058960a3178ea76fae4459f17d14d0110f22986"/>
+    <w:bookmarkEnd w:id="33"/>
+    <w:bookmarkStart w:id="34" w:name="X058960a3178ea76fae4459f17d14d0110f22986"/>
     <w:p>
       <w:pPr>
         <w:pStyle w:val="Heading1"/>
@@ -3912,8 +3245,8 @@
         <w:t xml:space="preserve">Utilice la guía oficial de CIS Controls v8.1 y la Especificación de Evaluación de Controles para el lenguaje exacto y los criterios de evaluación.</w:t>
       </w:r>
     </w:p>
-    <w:bookmarkEnd w:id="33"/>
-    <w:bookmarkStart w:id="34" w:name="control-3-protección-de-datos"/>
+    <w:bookmarkEnd w:id="34"/>
+    <w:bookmarkStart w:id="35" w:name="control-3-protección-de-datos"/>
     <w:p>
       <w:pPr>
         <w:pStyle w:val="Heading1"/>
@@ -4962,8 +4295,8 @@
         <w:t xml:space="preserve">Utilice la guía oficial de CIS Controls v8.1 y la Especificación de Evaluación de Controles para el lenguaje exacto y los criterios de evaluación.</w:t>
       </w:r>
     </w:p>
-    <w:bookmarkEnd w:id="34"/>
-    <w:bookmarkStart w:id="35" w:name="X5726a1fd72a9b03cfceb02e6154da5a71b09751"/>
+    <w:bookmarkEnd w:id="35"/>
+    <w:bookmarkStart w:id="36" w:name="X5726a1fd72a9b03cfceb02e6154da5a71b09751"/>
     <w:p>
       <w:pPr>
         <w:pStyle w:val="Heading1"/>
@@ -5875,8 +5208,8 @@
         <w:t xml:space="preserve">Utilice la guía oficial de CIS Controls v8.1 y la Especificación de Evaluación de Controles para el lenguaje exacto y los criterios de evaluación.</w:t>
       </w:r>
     </w:p>
-    <w:bookmarkEnd w:id="35"/>
-    <w:bookmarkStart w:id="36" w:name="control-5-gestión-de-cuentas"/>
+    <w:bookmarkEnd w:id="36"/>
+    <w:bookmarkStart w:id="37" w:name="control-5-gestión-de-cuentas"/>
     <w:p>
       <w:pPr>
         <w:pStyle w:val="Heading1"/>
@@ -6416,8 +5749,8 @@
         <w:t xml:space="preserve">Utilice la guía oficial de CIS Controls v8.1 y la Especificación de Evaluación de Controles para el lenguaje exacto y los criterios de evaluación.</w:t>
       </w:r>
     </w:p>
-    <w:bookmarkEnd w:id="36"/>
-    <w:bookmarkStart w:id="37" w:name="control-6-gestión-del-control-de-acceso"/>
+    <w:bookmarkEnd w:id="37"/>
+    <w:bookmarkStart w:id="38" w:name="control-6-gestión-del-control-de-acceso"/>
     <w:p>
       <w:pPr>
         <w:pStyle w:val="Heading1"/>
@@ -7094,8 +6427,8 @@
         <w:t xml:space="preserve">Utilice la guía oficial de CIS Controls v8.1 y la Especificación de Evaluación de Controles para el lenguaje exacto y los criterios de evaluación.</w:t>
       </w:r>
     </w:p>
-    <w:bookmarkEnd w:id="37"/>
-    <w:bookmarkStart w:id="38" w:name="Xbb65cd3c0852d2cacd0d350cee6556ebc7f386f"/>
+    <w:bookmarkEnd w:id="38"/>
+    <w:bookmarkStart w:id="39" w:name="Xbb65cd3c0852d2cacd0d350cee6556ebc7f386f"/>
     <w:p>
       <w:pPr>
         <w:pStyle w:val="Heading1"/>
@@ -7710,8 +7043,8 @@
         <w:t xml:space="preserve">Utilice la guía oficial de CIS Controls v8.1 y la Especificación de Evaluación de Controles para el lenguaje exacto y los criterios de evaluación.</w:t>
       </w:r>
     </w:p>
-    <w:bookmarkEnd w:id="38"/>
-    <w:bookmarkStart w:id="39" w:name="Xc9ae7a6a9f2f867deb1d535d2659da3bc080871"/>
+    <w:bookmarkEnd w:id="39"/>
+    <w:bookmarkStart w:id="40" w:name="Xc9ae7a6a9f2f867deb1d535d2659da3bc080871"/>
     <w:p>
       <w:pPr>
         <w:pStyle w:val="Heading1"/>
@@ -8623,8 +7956,8 @@
         <w:t xml:space="preserve">Utilice la guía oficial de CIS Controls v8.1 y la Especificación de Evaluación de Controles para el lenguaje exacto y los criterios de evaluación.</w:t>
       </w:r>
     </w:p>
-    <w:bookmarkEnd w:id="39"/>
-    <w:bookmarkStart w:id="40" w:name="X24aed13b821462b02538357a9cec02f47fbc094"/>
+    <w:bookmarkEnd w:id="40"/>
+    <w:bookmarkStart w:id="41" w:name="X24aed13b821462b02538357a9cec02f47fbc094"/>
     <w:p>
       <w:pPr>
         <w:pStyle w:val="Heading1"/>
@@ -9226,8 +8559,8 @@
         <w:t xml:space="preserve">Utilice la guía oficial de CIS Controls v8.1 y la Especificación de Evaluación de Controles para el lenguaje exacto y los criterios de evaluación.</w:t>
       </w:r>
     </w:p>
-    <w:bookmarkEnd w:id="40"/>
-    <w:bookmarkStart w:id="41" w:name="control-10-defensas-contra-malware"/>
+    <w:bookmarkEnd w:id="41"/>
+    <w:bookmarkStart w:id="42" w:name="control-10-defensas-contra-malware"/>
     <w:p>
       <w:pPr>
         <w:pStyle w:val="Heading1"/>
@@ -9829,8 +9162,8 @@
         <w:t xml:space="preserve">Utilice la guía oficial de CIS Controls v8.1 y la Especificación de Evaluación de Controles para el lenguaje exacto y los criterios de evaluación.</w:t>
       </w:r>
     </w:p>
-    <w:bookmarkEnd w:id="41"/>
-    <w:bookmarkStart w:id="42" w:name="control-11-recuperación-de-datos"/>
+    <w:bookmarkEnd w:id="42"/>
+    <w:bookmarkStart w:id="43" w:name="control-11-recuperación-de-datos"/>
     <w:p>
       <w:pPr>
         <w:pStyle w:val="Heading1"/>
@@ -10308,8 +9641,8 @@
         <w:t xml:space="preserve">Utilice la guía oficial de CIS Controls v8.1 y la Especificación de Evaluación de Controles para el lenguaje exacto y los criterios de evaluación.</w:t>
       </w:r>
     </w:p>
-    <w:bookmarkEnd w:id="42"/>
-    <w:bookmarkStart w:id="43" w:name="X304ee8a8ca1b15d2591f68ec8c679233dc80285"/>
+    <w:bookmarkEnd w:id="43"/>
+    <w:bookmarkStart w:id="44" w:name="X304ee8a8ca1b15d2591f68ec8c679233dc80285"/>
     <w:p>
       <w:pPr>
         <w:pStyle w:val="Heading1"/>
@@ -10973,8 +10306,8 @@
         <w:t xml:space="preserve">Utilice la guía oficial de CIS Controls v8.1 y la Especificación de Evaluación de Controles para el lenguaje exacto y los criterios de evaluación.</w:t>
       </w:r>
     </w:p>
-    <w:bookmarkEnd w:id="43"/>
-    <w:bookmarkStart w:id="44" w:name="control-13-monitoreo-y-defensa-de-la-red"/>
+    <w:bookmarkEnd w:id="44"/>
+    <w:bookmarkStart w:id="45" w:name="control-13-monitoreo-y-defensa-de-la-red"/>
     <w:p>
       <w:pPr>
         <w:pStyle w:val="Heading1"/>
@@ -11837,8 +11170,8 @@
         <w:t xml:space="preserve">Utilice la guía oficial de CIS Controls v8.1 y la Especificación de Evaluación de Controles para el lenguaje exacto y los criterios de evaluación.</w:t>
       </w:r>
     </w:p>
-    <w:bookmarkEnd w:id="44"/>
-    <w:bookmarkStart w:id="45" w:name="X4ecc7d63aa0bffe3698d39ecd98ad6666a16b9d"/>
+    <w:bookmarkEnd w:id="45"/>
+    <w:bookmarkStart w:id="46" w:name="X4ecc7d63aa0bffe3698d39ecd98ad6666a16b9d"/>
     <w:p>
       <w:pPr>
         <w:pStyle w:val="Heading1"/>
@@ -12564,8 +11897,8 @@
         <w:t xml:space="preserve">Utilice la guía oficial de CIS Controls v8.1 y la Especificación de Evaluación de Controles para el lenguaje exacto y los criterios de evaluación.</w:t>
       </w:r>
     </w:p>
-    <w:bookmarkEnd w:id="45"/>
-    <w:bookmarkStart w:id="46" w:name="Xa048e4e27fdd744a5076bc25010520fdecc0c30"/>
+    <w:bookmarkEnd w:id="46"/>
+    <w:bookmarkStart w:id="47" w:name="Xa048e4e27fdd744a5076bc25010520fdecc0c30"/>
     <w:p>
       <w:pPr>
         <w:pStyle w:val="Heading1"/>
@@ -13167,8 +12500,8 @@
         <w:t xml:space="preserve">Utilice la guía oficial de CIS Controls v8.1 y la Especificación de Evaluación de Controles para el lenguaje exacto y los criterios de evaluación.</w:t>
       </w:r>
     </w:p>
-    <w:bookmarkEnd w:id="46"/>
-    <w:bookmarkStart w:id="47" w:name="X5e0698034c3a8368f1d805de3798727b85c54b8"/>
+    <w:bookmarkEnd w:id="47"/>
+    <w:bookmarkStart w:id="48" w:name="X5e0698034c3a8368f1d805de3798727b85c54b8"/>
     <w:p>
       <w:pPr>
         <w:pStyle w:val="Heading1"/>
@@ -14204,8 +13537,8 @@
         <w:t xml:space="preserve">Utilice la guía oficial de CIS Controls v8.1 y la Especificación de Evaluación de Controles para el lenguaje exacto y los criterios de evaluación.</w:t>
       </w:r>
     </w:p>
-    <w:bookmarkEnd w:id="47"/>
-    <w:bookmarkStart w:id="48" w:name="X81bcab1ee2e08fb2cedbb65af68432a47fa8998"/>
+    <w:bookmarkEnd w:id="48"/>
+    <w:bookmarkStart w:id="49" w:name="X81bcab1ee2e08fb2cedbb65af68432a47fa8998"/>
     <w:p>
       <w:pPr>
         <w:pStyle w:val="Heading1"/>
@@ -14972,8 +14305,8 @@
         <w:t xml:space="preserve">Utilice la guía oficial de CIS Controls v8.1 y la Especificación para la Evaluación de Controles para consultar el lenguaje exacto de cada Salvaguarda, la clase de activo, la función de seguridad, el Grupo de Implementación, las dependencias, las entradas, las operaciones, las medidas, las métricas y la revisión de procedimientos.</w:t>
       </w:r>
     </w:p>
-    <w:bookmarkEnd w:id="48"/>
-    <w:bookmarkStart w:id="49" w:name="control-18-pruebas-de-penetración"/>
+    <w:bookmarkEnd w:id="49"/>
+    <w:bookmarkStart w:id="50" w:name="control-18-pruebas-de-penetración"/>
     <w:p>
       <w:pPr>
         <w:pStyle w:val="Heading1"/>
@@ -15451,8 +14784,8 @@
         <w:t xml:space="preserve">Utilice la guía oficial de CIS Controls v8.1 y la Especificación para la Evaluación de Controles para consultar el lenguaje exacto de cada Salvaguarda, la clase de activo, la función de seguridad, el Grupo de Implementación, las dependencias, las entradas, las operaciones, las medidas, las métricas y la revisión de procedimientos.</w:t>
       </w:r>
     </w:p>
-    <w:bookmarkEnd w:id="49"/>
-    <w:bookmarkStart w:id="50" w:name="herramientas-de-código-abierto"/>
+    <w:bookmarkEnd w:id="50"/>
+    <w:bookmarkStart w:id="51" w:name="herramientas-de-código-abierto"/>
     <w:p>
       <w:pPr>
         <w:pStyle w:val="Heading1"/>
@@ -16186,8 +15519,8 @@
         </w:tc>
       </w:tr>
     </w:tbl>
-    <w:bookmarkEnd w:id="50"/>
-    <w:bookmarkStart w:id="51" w:name="Xbc4a4dbf2d9ff0eb677f14739cf1d43ac88337f"/>
+    <w:bookmarkEnd w:id="51"/>
+    <w:bookmarkStart w:id="52" w:name="Xbc4a4dbf2d9ff0eb677f14739cf1d43ac88337f"/>
     <w:p>
       <w:pPr>
         <w:pStyle w:val="Heading1"/>
@@ -16212,7 +15545,7 @@
       <w:pPr>
         <w:numPr>
           <w:ilvl w:val="0"/>
-          <w:numId w:val="1007"/>
+          <w:numId w:val="1008"/>
         </w:numPr>
       </w:pPr>
       <w:r>
@@ -16223,7 +15556,7 @@
       <w:pPr>
         <w:numPr>
           <w:ilvl w:val="0"/>
-          <w:numId w:val="1007"/>
+          <w:numId w:val="1008"/>
         </w:numPr>
       </w:pPr>
       <w:r>
@@ -16234,7 +15567,7 @@
       <w:pPr>
         <w:numPr>
           <w:ilvl w:val="0"/>
-          <w:numId w:val="1007"/>
+          <w:numId w:val="1008"/>
         </w:numPr>
       </w:pPr>
       <w:r>
@@ -16245,7 +15578,7 @@
       <w:pPr>
         <w:numPr>
           <w:ilvl w:val="0"/>
-          <w:numId w:val="1007"/>
+          <w:numId w:val="1008"/>
         </w:numPr>
       </w:pPr>
       <w:r>
@@ -16256,7 +15589,7 @@
       <w:pPr>
         <w:numPr>
           <w:ilvl w:val="0"/>
-          <w:numId w:val="1007"/>
+          <w:numId w:val="1008"/>
         </w:numPr>
       </w:pPr>
       <w:r>
@@ -16267,7 +15600,7 @@
       <w:pPr>
         <w:numPr>
           <w:ilvl w:val="0"/>
-          <w:numId w:val="1007"/>
+          <w:numId w:val="1008"/>
         </w:numPr>
       </w:pPr>
       <w:r>
@@ -16278,7 +15611,7 @@
       <w:pPr>
         <w:numPr>
           <w:ilvl w:val="0"/>
-          <w:numId w:val="1007"/>
+          <w:numId w:val="1008"/>
         </w:numPr>
       </w:pPr>
       <w:r>
@@ -16289,7 +15622,7 @@
       <w:pPr>
         <w:numPr>
           <w:ilvl w:val="0"/>
-          <w:numId w:val="1007"/>
+          <w:numId w:val="1008"/>
         </w:numPr>
       </w:pPr>
       <w:r>
@@ -16666,8 +15999,8 @@
         </w:tc>
       </w:tr>
     </w:tbl>
-    <w:bookmarkEnd w:id="51"/>
-    <w:bookmarkStart w:id="53" w:name="guía-profesional-para-analistas-junior"/>
+    <w:bookmarkEnd w:id="52"/>
+    <w:bookmarkStart w:id="54" w:name="guía-profesional-para-analistas-junior"/>
     <w:p>
       <w:pPr>
         <w:pStyle w:val="Heading1"/>
@@ -16793,7 +16126,7 @@
         <w:t xml:space="preserve">Analista de programas de ciberseguridad</w:t>
       </w:r>
     </w:p>
-    <w:bookmarkStart w:id="52" w:name="trabajo-típico-de-nivel-junior"/>
+    <w:bookmarkStart w:id="53" w:name="trabajo-típico-de-nivel-junior"/>
     <w:p>
       <w:pPr>
         <w:pStyle w:val="Heading2"/>
@@ -16806,7 +16139,7 @@
       <w:pPr>
         <w:numPr>
           <w:ilvl w:val="0"/>
-          <w:numId w:val="1008"/>
+          <w:numId w:val="1009"/>
         </w:numPr>
       </w:pPr>
       <w:r>
@@ -16817,7 +16150,7 @@
       <w:pPr>
         <w:numPr>
           <w:ilvl w:val="0"/>
-          <w:numId w:val="1008"/>
+          <w:numId w:val="1009"/>
         </w:numPr>
       </w:pPr>
       <w:r>
@@ -16828,7 +16161,7 @@
       <w:pPr>
         <w:numPr>
           <w:ilvl w:val="0"/>
-          <w:numId w:val="1008"/>
+          <w:numId w:val="1009"/>
         </w:numPr>
       </w:pPr>
       <w:r>
@@ -16839,7 +16172,7 @@
       <w:pPr>
         <w:numPr>
           <w:ilvl w:val="0"/>
-          <w:numId w:val="1008"/>
+          <w:numId w:val="1009"/>
         </w:numPr>
       </w:pPr>
       <w:r>
@@ -16850,7 +16183,7 @@
       <w:pPr>
         <w:numPr>
           <w:ilvl w:val="0"/>
-          <w:numId w:val="1008"/>
+          <w:numId w:val="1009"/>
         </w:numPr>
       </w:pPr>
       <w:r>
@@ -16861,7 +16194,7 @@
       <w:pPr>
         <w:numPr>
           <w:ilvl w:val="0"/>
-          <w:numId w:val="1008"/>
+          <w:numId w:val="1009"/>
         </w:numPr>
       </w:pPr>
       <w:r>
@@ -16872,7 +16205,7 @@
       <w:pPr>
         <w:numPr>
           <w:ilvl w:val="0"/>
-          <w:numId w:val="1008"/>
+          <w:numId w:val="1009"/>
         </w:numPr>
       </w:pPr>
       <w:r>
@@ -17110,9 +16443,9 @@
         </w:tc>
       </w:tr>
     </w:tbl>
-    <w:bookmarkEnd w:id="52"/>
     <w:bookmarkEnd w:id="53"/>
-    <w:bookmarkStart w:id="54" w:name="laboratorio-y-portafolio-ficticios"/>
+    <w:bookmarkEnd w:id="54"/>
+    <w:bookmarkStart w:id="55" w:name="laboratorio-y-portafolio-ficticios"/>
     <w:p>
       <w:pPr>
         <w:pStyle w:val="Heading1"/>
@@ -17175,7 +16508,7 @@
       <w:pPr>
         <w:numPr>
           <w:ilvl w:val="0"/>
-          <w:numId w:val="1009"/>
+          <w:numId w:val="1010"/>
         </w:numPr>
       </w:pPr>
       <w:r>
@@ -17186,7 +16519,7 @@
       <w:pPr>
         <w:numPr>
           <w:ilvl w:val="0"/>
-          <w:numId w:val="1009"/>
+          <w:numId w:val="1010"/>
         </w:numPr>
       </w:pPr>
       <w:r>
@@ -17197,7 +16530,7 @@
       <w:pPr>
         <w:numPr>
           <w:ilvl w:val="0"/>
-          <w:numId w:val="1009"/>
+          <w:numId w:val="1010"/>
         </w:numPr>
       </w:pPr>
       <w:r>
@@ -17208,7 +16541,7 @@
       <w:pPr>
         <w:numPr>
           <w:ilvl w:val="0"/>
-          <w:numId w:val="1009"/>
+          <w:numId w:val="1010"/>
         </w:numPr>
       </w:pPr>
       <w:r>
@@ -17219,7 +16552,7 @@
       <w:pPr>
         <w:numPr>
           <w:ilvl w:val="0"/>
-          <w:numId w:val="1009"/>
+          <w:numId w:val="1010"/>
         </w:numPr>
       </w:pPr>
       <w:r>
@@ -17230,7 +16563,7 @@
       <w:pPr>
         <w:numPr>
           <w:ilvl w:val="0"/>
-          <w:numId w:val="1009"/>
+          <w:numId w:val="1010"/>
         </w:numPr>
       </w:pPr>
       <w:r>
@@ -17241,7 +16574,7 @@
       <w:pPr>
         <w:numPr>
           <w:ilvl w:val="0"/>
-          <w:numId w:val="1009"/>
+          <w:numId w:val="1010"/>
         </w:numPr>
       </w:pPr>
       <w:r>
@@ -17252,7 +16585,7 @@
       <w:pPr>
         <w:numPr>
           <w:ilvl w:val="0"/>
-          <w:numId w:val="1009"/>
+          <w:numId w:val="1010"/>
         </w:numPr>
       </w:pPr>
       <w:r>
@@ -17263,7 +16596,7 @@
       <w:pPr>
         <w:numPr>
           <w:ilvl w:val="0"/>
-          <w:numId w:val="1009"/>
+          <w:numId w:val="1010"/>
         </w:numPr>
       </w:pPr>
       <w:r>
@@ -17274,7 +16607,7 @@
       <w:pPr>
         <w:numPr>
           <w:ilvl w:val="0"/>
-          <w:numId w:val="1009"/>
+          <w:numId w:val="1010"/>
         </w:numPr>
       </w:pPr>
       <w:r>
@@ -17285,7 +16618,7 @@
       <w:pPr>
         <w:numPr>
           <w:ilvl w:val="0"/>
-          <w:numId w:val="1009"/>
+          <w:numId w:val="1010"/>
         </w:numPr>
       </w:pPr>
       <w:r>
@@ -17549,8 +16882,8 @@
         </w:tc>
       </w:tr>
     </w:tbl>
-    <w:bookmarkEnd w:id="54"/>
-    <w:bookmarkStart w:id="55" w:name="plan-de-aprendizaje-de-treinta-días"/>
+    <w:bookmarkEnd w:id="55"/>
+    <w:bookmarkStart w:id="56" w:name="plan-de-aprendizaje-de-treinta-días"/>
     <w:p>
       <w:pPr>
         <w:pStyle w:val="Heading1"/>
@@ -17979,8 +17312,8 @@
         </w:tc>
       </w:tr>
     </w:tbl>
-    <w:bookmarkEnd w:id="55"/>
-    <w:bookmarkStart w:id="64" w:name="cuáles-son-los-controles-cis"/>
+    <w:bookmarkEnd w:id="56"/>
+    <w:bookmarkStart w:id="65" w:name="cuáles-son-los-controles-cis"/>
     <w:p>
       <w:pPr>
         <w:pStyle w:val="Heading1"/>
@@ -17997,7 +17330,7 @@
         <w:t xml:space="preserve">Un conjunto priorizado de mejores prácticas defensivas organizadas en 18 Controles y 153 Salvaguardias enfocadas.</w:t>
       </w:r>
     </w:p>
-    <w:bookmarkStart w:id="56" w:name="qué-es-ig1"/>
+    <w:bookmarkStart w:id="57" w:name="qué-es-ig1"/>
     <w:p>
       <w:pPr>
         <w:pStyle w:val="Heading2"/>
@@ -18014,8 +17347,8 @@
         <w:t xml:space="preserve">El punto de partida esencial de la higiene cibernética 56-Safeguard que CIS recomienda que cada empresa comience.</w:t>
       </w:r>
     </w:p>
-    <w:bookmarkEnd w:id="56"/>
-    <w:bookmarkStart w:id="57" w:name="importa-ig1-cada-requisito"/>
+    <w:bookmarkEnd w:id="57"/>
+    <w:bookmarkStart w:id="58" w:name="importa-ig1-cada-requisito"/>
     <w:p>
       <w:pPr>
         <w:pStyle w:val="Heading2"/>
@@ -18032,8 +17365,8 @@
         <w:t xml:space="preserve">Es una base de referencia de priorización. El riesgo material, los contratos, las leyes, los clientes o los servicios críticos pueden requerir salvaguardias adicionales.</w:t>
       </w:r>
     </w:p>
-    <w:bookmarkEnd w:id="57"/>
-    <w:bookmarkStart w:id="58" w:name="cómo-mide-una-salvaguardia"/>
+    <w:bookmarkEnd w:id="58"/>
+    <w:bookmarkStart w:id="59" w:name="cómo-mide-una-salvaguardia"/>
     <w:p>
       <w:pPr>
         <w:pStyle w:val="Heading2"/>
@@ -18050,8 +17383,8 @@
         <w:t xml:space="preserve">Utilizar criterios oficiales, dependencias, hipótesis, aportaciones completas, operaciones definidas, medidas, métricas, revisión de procedimientos, excepciones y pruebas.</w:t>
       </w:r>
     </w:p>
-    <w:bookmarkEnd w:id="58"/>
-    <w:bookmarkStart w:id="59" w:name="por-qué-son-importantes-los-inventarios"/>
+    <w:bookmarkEnd w:id="59"/>
+    <w:bookmarkStart w:id="60" w:name="por-qué-son-importantes-los-inventarios"/>
     <w:p>
       <w:pPr>
         <w:pStyle w:val="Heading2"/>
@@ -18068,8 +17401,8 @@
         <w:t xml:space="preserve">Definen a las poblaciones que deben cubrir los controles de configuración, vulnerabilidad, registro, recuperación y respuesta.</w:t>
       </w:r>
     </w:p>
-    <w:bookmarkEnd w:id="59"/>
-    <w:bookmarkStart w:id="60" w:name="X0178e2ad2964cbab3c805028646c475c824a062"/>
+    <w:bookmarkEnd w:id="60"/>
+    <w:bookmarkStart w:id="61" w:name="X0178e2ad2964cbab3c805028646c475c824a062"/>
     <w:p>
       <w:pPr>
         <w:pStyle w:val="Heading2"/>
@@ -18086,8 +17419,8 @@
         <w:t xml:space="preserve">Un escaneo identifica principalmente debilidades conocidas; la prueba de penetración utiliza el análisis humano calificado y la explotación controlada para evaluar el impacto y la resiliencia.</w:t>
       </w:r>
     </w:p>
-    <w:bookmarkEnd w:id="60"/>
-    <w:bookmarkStart w:id="61" w:name="X2a3d8d973bfa0b5ed7501efb90ac72ec1b0ecc0"/>
+    <w:bookmarkEnd w:id="61"/>
+    <w:bookmarkStart w:id="62" w:name="X2a3d8d973bfa0b5ed7501efb90ac72ec1b0ecc0"/>
     <w:p>
       <w:pPr>
         <w:pStyle w:val="Heading2"/>
@@ -18104,8 +17437,8 @@
         <w:t xml:space="preserve">No. Identifica las relaciones, pero la organización debe probar el requisito y la evidencia exacta aplicable.</w:t>
       </w:r>
     </w:p>
-    <w:bookmarkEnd w:id="61"/>
-    <w:bookmarkStart w:id="62" w:name="qué-puede-concluir-un-analista-junior"/>
+    <w:bookmarkEnd w:id="62"/>
+    <w:bookmarkStart w:id="63" w:name="qué-puede-concluir-un-analista-junior"/>
     <w:p>
       <w:pPr>
         <w:pStyle w:val="Heading2"/>
@@ -18122,8 +17455,8 @@
         <w:t xml:space="preserve">Sólo lo que el alcance definido y el soporte de evidencia confiable, con muestreo y limitaciones claramente reveladas.</w:t>
       </w:r>
     </w:p>
-    <w:bookmarkEnd w:id="62"/>
-    <w:bookmarkStart w:id="63" w:name="preguntas-para-hacer-al-empleador"/>
+    <w:bookmarkEnd w:id="63"/>
+    <w:bookmarkStart w:id="64" w:name="preguntas-para-hacer-al-empleador"/>
     <w:p>
       <w:pPr>
         <w:pStyle w:val="Heading2"/>
@@ -18188,9 +17521,9 @@
         <w:t xml:space="preserve">¿Cómo revisará el trabajo de los funcionarios superiores?</w:t>
       </w:r>
     </w:p>
-    <w:bookmarkEnd w:id="63"/>
     <w:bookmarkEnd w:id="64"/>
-    <w:bookmarkStart w:id="74" w:name="plantillas-glosario-índice-y-referencias"/>
+    <w:bookmarkEnd w:id="65"/>
+    <w:bookmarkStart w:id="75" w:name="plantillas-glosario-índice-y-referencias"/>
     <w:p>
       <w:pPr>
         <w:pStyle w:val="Heading1"/>
@@ -18211,7 +17544,7 @@
         <w:t xml:space="preserve">Estructuras de trabajo reutilizables, términos importantes y puntos de partida autorizados.</w:t>
       </w:r>
     </w:p>
-    <w:bookmarkStart w:id="65" w:name="hoja-de-trabajo-para-medir-salvaguardas"/>
+    <w:bookmarkStart w:id="66" w:name="hoja-de-trabajo-para-medir-salvaguardas"/>
     <w:p>
       <w:pPr>
         <w:pStyle w:val="Heading2"/>
@@ -18521,8 +17854,8 @@
         </w:tc>
       </w:tr>
     </w:tbl>
-    <w:bookmarkEnd w:id="65"/>
-    <w:bookmarkStart w:id="66" w:name="registro-de-hallazgos-y-nuevas-pruebas"/>
+    <w:bookmarkEnd w:id="66"/>
+    <w:bookmarkStart w:id="67" w:name="registro-de-hallazgos-y-nuevas-pruebas"/>
     <w:p>
       <w:pPr>
         <w:pStyle w:val="Heading2"/>
@@ -18832,8 +18165,8 @@
         </w:tc>
       </w:tr>
     </w:tbl>
-    <w:bookmarkEnd w:id="66"/>
-    <w:bookmarkStart w:id="67" w:name="glosario"/>
+    <w:bookmarkEnd w:id="67"/>
+    <w:bookmarkStart w:id="68" w:name="glosario"/>
     <w:p>
       <w:pPr>
         <w:pStyle w:val="Heading2"/>
@@ -19221,8 +18554,8 @@
         </w:tc>
       </w:tr>
     </w:tbl>
-    <w:bookmarkEnd w:id="67"/>
-    <w:bookmarkStart w:id="68" w:name="índice-temático"/>
+    <w:bookmarkEnd w:id="68"/>
+    <w:bookmarkStart w:id="69" w:name="índice-temático"/>
     <w:p>
       <w:pPr>
         <w:pStyle w:val="Heading2"/>
@@ -19688,8 +19021,8 @@
         </w:tc>
       </w:tr>
     </w:tbl>
-    <w:bookmarkEnd w:id="68"/>
-    <w:bookmarkStart w:id="73" w:name="referencias-oficiales"/>
+    <w:bookmarkEnd w:id="69"/>
+    <w:bookmarkStart w:id="74" w:name="referencias-oficiales"/>
     <w:p>
       <w:pPr>
         <w:pStyle w:val="Heading2"/>
@@ -19702,11 +19035,11 @@
       <w:pPr>
         <w:numPr>
           <w:ilvl w:val="0"/>
-          <w:numId w:val="1010"/>
+          <w:numId w:val="1011"/>
         </w:numPr>
         <w:pStyle w:val="Compact"/>
       </w:pPr>
-      <w:hyperlink r:id="rId69">
+      <w:hyperlink r:id="rId70">
         <w:r>
           <w:rPr>
             <w:rStyle w:val="Hyperlink"/>
@@ -19719,11 +19052,11 @@
       <w:pPr>
         <w:numPr>
           <w:ilvl w:val="0"/>
-          <w:numId w:val="1010"/>
+          <w:numId w:val="1011"/>
         </w:numPr>
         <w:pStyle w:val="Compact"/>
       </w:pPr>
-      <w:hyperlink r:id="rId70">
+      <w:hyperlink r:id="rId71">
         <w:r>
           <w:rPr>
             <w:rStyle w:val="Hyperlink"/>
@@ -19736,11 +19069,11 @@
       <w:pPr>
         <w:numPr>
           <w:ilvl w:val="0"/>
-          <w:numId w:val="1010"/>
+          <w:numId w:val="1011"/>
         </w:numPr>
         <w:pStyle w:val="Compact"/>
       </w:pPr>
-      <w:hyperlink r:id="rId71">
+      <w:hyperlink r:id="rId72">
         <w:r>
           <w:rPr>
             <w:rStyle w:val="Hyperlink"/>
@@ -19753,11 +19086,11 @@
       <w:pPr>
         <w:numPr>
           <w:ilvl w:val="0"/>
-          <w:numId w:val="1010"/>
+          <w:numId w:val="1011"/>
         </w:numPr>
         <w:pStyle w:val="Compact"/>
       </w:pPr>
-      <w:hyperlink r:id="rId72">
+      <w:hyperlink r:id="rId73">
         <w:r>
           <w:rPr>
             <w:rStyle w:val="Hyperlink"/>
@@ -19766,8 +19099,8 @@
         </w:r>
       </w:hyperlink>
     </w:p>
-    <w:bookmarkEnd w:id="73"/>
     <w:bookmarkEnd w:id="74"/>
+    <w:bookmarkEnd w:id="75"/>
     <w:sectPr/>
   </w:body>
 </w:document>
@@ -20042,18 +19375,6 @@
     <w:abstractNumId w:val="991"/>
   </w:num>
   <w:num w:numId="1002">
-    <w:abstractNumId w:val="991"/>
-  </w:num>
-  <w:num w:numId="1003">
-    <w:abstractNumId w:val="991"/>
-  </w:num>
-  <w:num w:numId="1004">
-    <w:abstractNumId w:val="991"/>
-  </w:num>
-  <w:num w:numId="1005">
-    <w:abstractNumId w:val="991"/>
-  </w:num>
-  <w:num w:numId="1006">
     <w:abstractNumId w:val="99411"/>
     <w:lvlOverride w:ilvl="0">
       <w:startOverride w:val="1"/>
@@ -20082,6 +19403,18 @@
     <w:lvlOverride w:ilvl="8">
       <w:startOverride w:val="1"/>
     </w:lvlOverride>
+  </w:num>
+  <w:num w:numId="1003">
+    <w:abstractNumId w:val="991"/>
+  </w:num>
+  <w:num w:numId="1004">
+    <w:abstractNumId w:val="991"/>
+  </w:num>
+  <w:num w:numId="1005">
+    <w:abstractNumId w:val="991"/>
+  </w:num>
+  <w:num w:numId="1006">
+    <w:abstractNumId w:val="991"/>
   </w:num>
   <w:num w:numId="1007">
     <w:abstractNumId w:val="99411"/>
@@ -20114,9 +19447,6 @@
     </w:lvlOverride>
   </w:num>
   <w:num w:numId="1008">
-    <w:abstractNumId w:val="991"/>
-  </w:num>
-  <w:num w:numId="1009">
     <w:abstractNumId w:val="99411"/>
     <w:lvlOverride w:ilvl="0">
       <w:startOverride w:val="1"/>
@@ -20146,7 +19476,40 @@
       <w:startOverride w:val="1"/>
     </w:lvlOverride>
   </w:num>
+  <w:num w:numId="1009">
+    <w:abstractNumId w:val="991"/>
+  </w:num>
   <w:num w:numId="1010">
+    <w:abstractNumId w:val="99411"/>
+    <w:lvlOverride w:ilvl="0">
+      <w:startOverride w:val="1"/>
+    </w:lvlOverride>
+    <w:lvlOverride w:ilvl="1">
+      <w:startOverride w:val="1"/>
+    </w:lvlOverride>
+    <w:lvlOverride w:ilvl="2">
+      <w:startOverride w:val="1"/>
+    </w:lvlOverride>
+    <w:lvlOverride w:ilvl="3">
+      <w:startOverride w:val="1"/>
+    </w:lvlOverride>
+    <w:lvlOverride w:ilvl="4">
+      <w:startOverride w:val="1"/>
+    </w:lvlOverride>
+    <w:lvlOverride w:ilvl="5">
+      <w:startOverride w:val="1"/>
+    </w:lvlOverride>
+    <w:lvlOverride w:ilvl="6">
+      <w:startOverride w:val="1"/>
+    </w:lvlOverride>
+    <w:lvlOverride w:ilvl="7">
+      <w:startOverride w:val="1"/>
+    </w:lvlOverride>
+    <w:lvlOverride w:ilvl="8">
+      <w:startOverride w:val="1"/>
+    </w:lvlOverride>
+  </w:num>
+  <w:num w:numId="1011">
     <w:abstractNumId w:val="991"/>
   </w:num>
 </w:numbering>

</xml_diff>

<commit_message>
Restore complete CIS Spanish figures and rebuild publication
</commit_message>
<xml_diff>
--- a/01-foundations/CIS_Controls_v8.1/Espanol/CIS_Critical_Security_Controls_v8.1_Practical_Manager_and_Junior_Analyst_Manual_Espanol_v1.0.docx
+++ b/01-foundations/CIS_Controls_v8.1/Espanol/CIS_Critical_Security_Controls_v8.1_Practical_Manager_and_Junior_Analyst_Manual_Espanol_v1.0.docx
@@ -521,7 +521,7 @@
       </w:r>
     </w:p>
     <w:bookmarkEnd w:id="24"/>
-    <w:bookmarkStart w:id="25" w:name="fundamentos-de-cis-controls-v8.1"/>
+    <w:bookmarkStart w:id="28" w:name="fundamentos-de-cis-controls-v8.1"/>
     <w:p>
       <w:pPr>
         <w:pStyle w:val="Heading1"/>
@@ -542,31 +542,53 @@
         <w:t xml:space="preserve">La versión vigente, su estructura, propósito y limitaciones.</w:t>
       </w:r>
     </w:p>
-    <w:tbl>
-      <w:tblPr>
-        <w:tblStyle w:val="FigureTable"/>
-        <w:tblW w:type="auto" w:w="0"/>
-        <w:tblLook w:firstRow="0" w:lastRow="0" w:firstColumn="0" w:lastColumn="0"/>
-        <w:jc w:val="center"/>
-      </w:tblPr>
-      <w:tblGrid>
-        <w:gridCol w:w="7920"/>
-      </w:tblGrid>
-      <w:tr>
-        <w:tc>
-          <w:tcPr/>
-          <w:p>
-            <w:pPr>
-              <w:pStyle w:val="Compact"/>
-              <w:jc w:val="center"/>
-            </w:pPr>
-            <w:r>
-              <w:t xml:space="preserve">Los Controles organizan 153 Salvaguardas en un programa defensivo práctico.</w:t>
-            </w:r>
-          </w:p>
-        </w:tc>
-      </w:tr>
-    </w:tbl>
+    <w:p>
+      <w:pPr>
+        <w:pStyle w:val="CaptionedFigure"/>
+      </w:pPr>
+      <w:r>
+        <w:drawing>
+          <wp:inline>
+            <wp:extent cx="5334000" cy="2963333"/>
+            <wp:effectExtent b="0" l="0" r="0" t="0"/>
+            <wp:docPr descr="Los Controles organizan 153 Salvaguardas en un programa defensivo práctico." title="" id="26" name="Picture"/>
+            <a:graphic>
+              <a:graphicData uri="http://schemas.openxmlformats.org/drawingml/2006/picture">
+                <pic:pic>
+                  <pic:nvPicPr>
+                    <pic:cNvPr descr="media/image1.png" id="27" name="Picture"/>
+                    <pic:cNvPicPr>
+                      <a:picLocks noChangeArrowheads="1" noChangeAspect="1"/>
+                    </pic:cNvPicPr>
+                  </pic:nvPicPr>
+                  <pic:blipFill>
+                    <a:blip r:embed="rId25"/>
+                    <a:stretch>
+                      <a:fillRect/>
+                    </a:stretch>
+                  </pic:blipFill>
+                  <pic:spPr bwMode="auto">
+                    <a:xfrm>
+                      <a:off x="0" y="0"/>
+                      <a:ext cx="5334000" cy="2963333"/>
+                    </a:xfrm>
+                    <a:prstGeom prst="rect">
+                      <a:avLst/>
+                    </a:prstGeom>
+                    <a:noFill/>
+                    <a:ln w="9525">
+                      <a:noFill/>
+                      <a:headEnd/>
+                      <a:tailEnd/>
+                    </a:ln>
+                  </pic:spPr>
+                </pic:pic>
+              </a:graphicData>
+            </a:graphic>
+          </wp:inline>
+        </w:drawing>
+      </w:r>
+    </w:p>
     <w:p>
       <w:pPr>
         <w:pStyle w:val="ImageCaption"/>
@@ -854,8 +876,8 @@
         </w:tc>
       </w:tr>
     </w:tbl>
-    <w:bookmarkEnd w:id="25"/>
-    <w:bookmarkStart w:id="26" w:name="grupos-de-implementación-y-priorización"/>
+    <w:bookmarkEnd w:id="28"/>
+    <w:bookmarkStart w:id="32" w:name="grupos-de-implementación-y-priorización"/>
     <w:p>
       <w:pPr>
         <w:pStyle w:val="Heading1"/>
@@ -876,31 +898,53 @@
         <w:t xml:space="preserve">Cómo IG1, IG2 e IG3 ayudan a las organizaciones a elegir un punto de partida realista.</w:t>
       </w:r>
     </w:p>
-    <w:tbl>
-      <w:tblPr>
-        <w:tblStyle w:val="FigureTable"/>
-        <w:tblW w:type="auto" w:w="0"/>
-        <w:tblLook w:firstRow="0" w:lastRow="0" w:firstColumn="0" w:lastColumn="0"/>
-        <w:jc w:val="center"/>
-      </w:tblPr>
-      <w:tblGrid>
-        <w:gridCol w:w="7920"/>
-      </w:tblGrid>
-      <w:tr>
-        <w:tc>
-          <w:tcPr/>
-          <w:p>
-            <w:pPr>
-              <w:pStyle w:val="Compact"/>
-              <w:jc w:val="center"/>
-            </w:pPr>
-            <w:r>
-              <w:t xml:space="preserve">Cada Grupo de Implementación se apoya en el anterior; IG3 contiene todas las Salvaguardas.</w:t>
-            </w:r>
-          </w:p>
-        </w:tc>
-      </w:tr>
-    </w:tbl>
+    <w:p>
+      <w:pPr>
+        <w:pStyle w:val="CaptionedFigure"/>
+      </w:pPr>
+      <w:r>
+        <w:drawing>
+          <wp:inline>
+            <wp:extent cx="5334000" cy="2963333"/>
+            <wp:effectExtent b="0" l="0" r="0" t="0"/>
+            <wp:docPr descr="Cada Grupo de Implementación se apoya en el anterior; IG3 contiene todas las Salvaguardas." title="" id="30" name="Picture"/>
+            <a:graphic>
+              <a:graphicData uri="http://schemas.openxmlformats.org/drawingml/2006/picture">
+                <pic:pic>
+                  <pic:nvPicPr>
+                    <pic:cNvPr descr="media/image2.png" id="31" name="Picture"/>
+                    <pic:cNvPicPr>
+                      <a:picLocks noChangeArrowheads="1" noChangeAspect="1"/>
+                    </pic:cNvPicPr>
+                  </pic:nvPicPr>
+                  <pic:blipFill>
+                    <a:blip r:embed="rId29"/>
+                    <a:stretch>
+                      <a:fillRect/>
+                    </a:stretch>
+                  </pic:blipFill>
+                  <pic:spPr bwMode="auto">
+                    <a:xfrm>
+                      <a:off x="0" y="0"/>
+                      <a:ext cx="5334000" cy="2963333"/>
+                    </a:xfrm>
+                    <a:prstGeom prst="rect">
+                      <a:avLst/>
+                    </a:prstGeom>
+                    <a:noFill/>
+                    <a:ln w="9525">
+                      <a:noFill/>
+                      <a:headEnd/>
+                      <a:tailEnd/>
+                    </a:ln>
+                  </pic:spPr>
+                </pic:pic>
+              </a:graphicData>
+            </a:graphic>
+          </wp:inline>
+        </w:drawing>
+      </w:r>
+    </w:p>
     <w:p>
       <w:pPr>
         <w:pStyle w:val="ImageCaption"/>
@@ -1205,8 +1249,8 @@
         <w:t xml:space="preserve">Utilice CIS Controls Navigator para filtrar las Salvaguardas de v8.1 y revisar las correspondencias oficiales.</w:t>
       </w:r>
     </w:p>
-    <w:bookmarkEnd w:id="26"/>
-    <w:bookmarkStart w:id="27" w:name="gobernanza-alcance-y-responsabilidades"/>
+    <w:bookmarkEnd w:id="32"/>
+    <w:bookmarkStart w:id="33" w:name="gobernanza-alcance-y-responsabilidades"/>
     <w:p>
       <w:pPr>
         <w:pStyle w:val="Heading1"/>
@@ -1561,8 +1605,8 @@
         </w:tc>
       </w:tr>
     </w:tbl>
-    <w:bookmarkEnd w:id="27"/>
-    <w:bookmarkStart w:id="31" w:name="X969040e64682a9e2ef1455f79db293094636c49"/>
+    <w:bookmarkEnd w:id="33"/>
+    <w:bookmarkStart w:id="37" w:name="X969040e64682a9e2ef1455f79db293094636c49"/>
     <w:p>
       <w:pPr>
         <w:pStyle w:val="Heading1"/>
@@ -1592,18 +1636,18 @@
           <wp:inline>
             <wp:extent cx="5334000" cy="2497753"/>
             <wp:effectExtent b="0" l="0" r="0" t="0"/>
-            <wp:docPr descr="La especificación oficial avanza desde entradas de datos definidas hasta operaciones, medidas, métricas y revisión de procedimientos." title="" id="29" name="Picture"/>
+            <wp:docPr descr="La especificación oficial avanza desde entradas de datos definidas hasta operaciones, medidas, métricas y revisión de procedimientos." title="" id="35" name="Picture"/>
             <a:graphic>
               <a:graphicData uri="http://schemas.openxmlformats.org/drawingml/2006/picture">
                 <pic:pic>
                   <pic:nvPicPr>
-                    <pic:cNvPr descr="media/image3.png" id="30" name="Picture"/>
+                    <pic:cNvPr descr="media/image3.png" id="36" name="Picture"/>
                     <pic:cNvPicPr>
                       <a:picLocks noChangeArrowheads="1" noChangeAspect="1"/>
                     </pic:cNvPicPr>
                   </pic:nvPicPr>
                   <pic:blipFill>
-                    <a:blip r:embed="rId28"/>
+                    <a:blip r:embed="rId34"/>
                     <a:stretch>
                       <a:fillRect/>
                     </a:stretch>
@@ -1991,8 +2035,8 @@
         <w:t xml:space="preserve">Informe alcance, resultado, excepción, limitación, responsable, acción y fecha.</w:t>
       </w:r>
     </w:p>
-    <w:bookmarkEnd w:id="31"/>
-    <w:bookmarkStart w:id="32" w:name="hoja-de-ruta-de-implementación"/>
+    <w:bookmarkEnd w:id="37"/>
+    <w:bookmarkStart w:id="38" w:name="hoja-de-ruta-de-implementación"/>
     <w:p>
       <w:pPr>
         <w:pStyle w:val="Heading1"/>
@@ -2150,8 +2194,8 @@
         </w:tc>
       </w:tr>
     </w:tbl>
-    <w:bookmarkEnd w:id="32"/>
-    <w:bookmarkStart w:id="33" w:name="Xbf3cbb637452d72ada0a90fc9fdf7319b4fed2d"/>
+    <w:bookmarkEnd w:id="38"/>
+    <w:bookmarkStart w:id="42" w:name="Xbf3cbb637452d72ada0a90fc9fdf7319b4fed2d"/>
     <w:p>
       <w:pPr>
         <w:pStyle w:val="Heading1"/>
@@ -2174,8 +2218,58 @@
     </w:p>
     <w:p>
       <w:pPr>
-        <w:pStyle w:val="BodyText"/>
-      </w:pPr>
+        <w:pStyle w:val="CaptionedFigure"/>
+      </w:pPr>
+      <w:r>
+        <w:drawing>
+          <wp:inline>
+            <wp:extent cx="5334000" cy="2963333"/>
+            <wp:effectExtent b="0" l="0" r="0" t="0"/>
+            <wp:docPr descr="El descubrimiento, la conciliación, la respuesta y la revisión mantienen actualizadas las poblaciones fundamentales." title="" id="40" name="Picture"/>
+            <a:graphic>
+              <a:graphicData uri="http://schemas.openxmlformats.org/drawingml/2006/picture">
+                <pic:pic>
+                  <pic:nvPicPr>
+                    <pic:cNvPr descr="media/image4.png" id="41" name="Picture"/>
+                    <pic:cNvPicPr>
+                      <a:picLocks noChangeArrowheads="1" noChangeAspect="1"/>
+                    </pic:cNvPicPr>
+                  </pic:nvPicPr>
+                  <pic:blipFill>
+                    <a:blip r:embed="rId39"/>
+                    <a:stretch>
+                      <a:fillRect/>
+                    </a:stretch>
+                  </pic:blipFill>
+                  <pic:spPr bwMode="auto">
+                    <a:xfrm>
+                      <a:off x="0" y="0"/>
+                      <a:ext cx="5334000" cy="2963333"/>
+                    </a:xfrm>
+                    <a:prstGeom prst="rect">
+                      <a:avLst/>
+                    </a:prstGeom>
+                    <a:noFill/>
+                    <a:ln w="9525">
+                      <a:noFill/>
+                      <a:headEnd/>
+                      <a:tailEnd/>
+                    </a:ln>
+                  </pic:spPr>
+                </pic:pic>
+              </a:graphicData>
+            </a:graphic>
+          </wp:inline>
+        </w:drawing>
+      </w:r>
+    </w:p>
+    <w:p>
+      <w:pPr>
+        <w:pStyle w:val="ImageCaption"/>
+      </w:pPr>
+      <w:r>
+        <w:t xml:space="preserve">El descubrimiento, la conciliación, la respuesta y la revisión mantienen actualizadas las poblaciones fundamentales.</w:t>
+      </w:r>
     </w:p>
     <w:p>
       <w:pPr>
@@ -2642,8 +2736,8 @@
         <w:t xml:space="preserve">Utilice la guía oficial de CIS Controls v8.1 y la Especificación de Evaluación de Controles para el lenguaje exacto, la clase de activo, la función de seguridad, el Grupo de Implementación, las dependencias, las entradas, las operaciones, las medidas, las métricas y la revisión de procedimientos.</w:t>
       </w:r>
     </w:p>
-    <w:bookmarkEnd w:id="33"/>
-    <w:bookmarkStart w:id="34" w:name="X058960a3178ea76fae4459f17d14d0110f22986"/>
+    <w:bookmarkEnd w:id="42"/>
+    <w:bookmarkStart w:id="43" w:name="X058960a3178ea76fae4459f17d14d0110f22986"/>
     <w:p>
       <w:pPr>
         <w:pStyle w:val="Heading1"/>
@@ -3245,8 +3339,8 @@
         <w:t xml:space="preserve">Utilice la guía oficial de CIS Controls v8.1 y la Especificación de Evaluación de Controles para el lenguaje exacto y los criterios de evaluación.</w:t>
       </w:r>
     </w:p>
-    <w:bookmarkEnd w:id="34"/>
-    <w:bookmarkStart w:id="35" w:name="control-3-protección-de-datos"/>
+    <w:bookmarkEnd w:id="43"/>
+    <w:bookmarkStart w:id="47" w:name="control-3-protección-de-datos"/>
     <w:p>
       <w:pPr>
         <w:pStyle w:val="Heading1"/>
@@ -3269,8 +3363,58 @@
     </w:p>
     <w:p>
       <w:pPr>
-        <w:pStyle w:val="BodyText"/>
-      </w:pPr>
+        <w:pStyle w:val="CaptionedFigure"/>
+      </w:pPr>
+      <w:r>
+        <w:drawing>
+          <wp:inline>
+            <wp:extent cx="5334000" cy="2963333"/>
+            <wp:effectExtent b="0" l="0" r="0" t="0"/>
+            <wp:docPr descr="Descubrir, clasificar, proteger, conservar y eliminar datos según su sensibilidad y necesidad." title="" id="45" name="Picture"/>
+            <a:graphic>
+              <a:graphicData uri="http://schemas.openxmlformats.org/drawingml/2006/picture">
+                <pic:pic>
+                  <pic:nvPicPr>
+                    <pic:cNvPr descr="media/image5.png" id="46" name="Picture"/>
+                    <pic:cNvPicPr>
+                      <a:picLocks noChangeArrowheads="1" noChangeAspect="1"/>
+                    </pic:cNvPicPr>
+                  </pic:nvPicPr>
+                  <pic:blipFill>
+                    <a:blip r:embed="rId44"/>
+                    <a:stretch>
+                      <a:fillRect/>
+                    </a:stretch>
+                  </pic:blipFill>
+                  <pic:spPr bwMode="auto">
+                    <a:xfrm>
+                      <a:off x="0" y="0"/>
+                      <a:ext cx="5334000" cy="2963333"/>
+                    </a:xfrm>
+                    <a:prstGeom prst="rect">
+                      <a:avLst/>
+                    </a:prstGeom>
+                    <a:noFill/>
+                    <a:ln w="9525">
+                      <a:noFill/>
+                      <a:headEnd/>
+                      <a:tailEnd/>
+                    </a:ln>
+                  </pic:spPr>
+                </pic:pic>
+              </a:graphicData>
+            </a:graphic>
+          </wp:inline>
+        </w:drawing>
+      </w:r>
+    </w:p>
+    <w:p>
+      <w:pPr>
+        <w:pStyle w:val="ImageCaption"/>
+      </w:pPr>
+      <w:r>
+        <w:t xml:space="preserve">Descubrir, clasificar, proteger, conservar y eliminar datos según su sensibilidad y necesidad.</w:t>
+      </w:r>
     </w:p>
     <w:p>
       <w:pPr>
@@ -4295,8 +4439,8 @@
         <w:t xml:space="preserve">Utilice la guía oficial de CIS Controls v8.1 y la Especificación de Evaluación de Controles para el lenguaje exacto y los criterios de evaluación.</w:t>
       </w:r>
     </w:p>
-    <w:bookmarkEnd w:id="35"/>
-    <w:bookmarkStart w:id="36" w:name="X5726a1fd72a9b03cfceb02e6154da5a71b09751"/>
+    <w:bookmarkEnd w:id="47"/>
+    <w:bookmarkStart w:id="48" w:name="X5726a1fd72a9b03cfceb02e6154da5a71b09751"/>
     <w:p>
       <w:pPr>
         <w:pStyle w:val="Heading1"/>
@@ -5208,8 +5352,8 @@
         <w:t xml:space="preserve">Utilice la guía oficial de CIS Controls v8.1 y la Especificación de Evaluación de Controles para el lenguaje exacto y los criterios de evaluación.</w:t>
       </w:r>
     </w:p>
-    <w:bookmarkEnd w:id="36"/>
-    <w:bookmarkStart w:id="37" w:name="control-5-gestión-de-cuentas"/>
+    <w:bookmarkEnd w:id="48"/>
+    <w:bookmarkStart w:id="49" w:name="control-5-gestión-de-cuentas"/>
     <w:p>
       <w:pPr>
         <w:pStyle w:val="Heading1"/>
@@ -5749,8 +5893,8 @@
         <w:t xml:space="preserve">Utilice la guía oficial de CIS Controls v8.1 y la Especificación de Evaluación de Controles para el lenguaje exacto y los criterios de evaluación.</w:t>
       </w:r>
     </w:p>
-    <w:bookmarkEnd w:id="37"/>
-    <w:bookmarkStart w:id="38" w:name="control-6-gestión-del-control-de-acceso"/>
+    <w:bookmarkEnd w:id="49"/>
+    <w:bookmarkStart w:id="53" w:name="control-6-gestión-del-control-de-acceso"/>
     <w:p>
       <w:pPr>
         <w:pStyle w:val="Heading1"/>
@@ -5773,8 +5917,58 @@
     </w:p>
     <w:p>
       <w:pPr>
-        <w:pStyle w:val="BodyText"/>
-      </w:pPr>
+        <w:pStyle w:val="CaptionedFigure"/>
+      </w:pPr>
+      <w:r>
+        <w:drawing>
+          <wp:inline>
+            <wp:extent cx="5334000" cy="2963333"/>
+            <wp:effectExtent b="0" l="0" r="0" t="0"/>
+            <wp:docPr descr="Las cuentas y los privilegios requieren creación aprobada, autenticación sólida, revisión y revocación oportuna." title="" id="51" name="Picture"/>
+            <a:graphic>
+              <a:graphicData uri="http://schemas.openxmlformats.org/drawingml/2006/picture">
+                <pic:pic>
+                  <pic:nvPicPr>
+                    <pic:cNvPr descr="media/image6.png" id="52" name="Picture"/>
+                    <pic:cNvPicPr>
+                      <a:picLocks noChangeArrowheads="1" noChangeAspect="1"/>
+                    </pic:cNvPicPr>
+                  </pic:nvPicPr>
+                  <pic:blipFill>
+                    <a:blip r:embed="rId50"/>
+                    <a:stretch>
+                      <a:fillRect/>
+                    </a:stretch>
+                  </pic:blipFill>
+                  <pic:spPr bwMode="auto">
+                    <a:xfrm>
+                      <a:off x="0" y="0"/>
+                      <a:ext cx="5334000" cy="2963333"/>
+                    </a:xfrm>
+                    <a:prstGeom prst="rect">
+                      <a:avLst/>
+                    </a:prstGeom>
+                    <a:noFill/>
+                    <a:ln w="9525">
+                      <a:noFill/>
+                      <a:headEnd/>
+                      <a:tailEnd/>
+                    </a:ln>
+                  </pic:spPr>
+                </pic:pic>
+              </a:graphicData>
+            </a:graphic>
+          </wp:inline>
+        </w:drawing>
+      </w:r>
+    </w:p>
+    <w:p>
+      <w:pPr>
+        <w:pStyle w:val="ImageCaption"/>
+      </w:pPr>
+      <w:r>
+        <w:t xml:space="preserve">Las cuentas y los privilegios requieren creación aprobada, autenticación sólida, revisión y revocación oportuna.</w:t>
+      </w:r>
     </w:p>
     <w:p>
       <w:pPr>
@@ -6427,8 +6621,8 @@
         <w:t xml:space="preserve">Utilice la guía oficial de CIS Controls v8.1 y la Especificación de Evaluación de Controles para el lenguaje exacto y los criterios de evaluación.</w:t>
       </w:r>
     </w:p>
-    <w:bookmarkEnd w:id="38"/>
-    <w:bookmarkStart w:id="39" w:name="Xbb65cd3c0852d2cacd0d350cee6556ebc7f386f"/>
+    <w:bookmarkEnd w:id="53"/>
+    <w:bookmarkStart w:id="57" w:name="Xbb65cd3c0852d2cacd0d350cee6556ebc7f386f"/>
     <w:p>
       <w:pPr>
         <w:pStyle w:val="Heading1"/>
@@ -6451,8 +6645,58 @@
     </w:p>
     <w:p>
       <w:pPr>
-        <w:pStyle w:val="BodyText"/>
-      </w:pPr>
+        <w:pStyle w:val="CaptionedFigure"/>
+      </w:pPr>
+      <w:r>
+        <w:drawing>
+          <wp:inline>
+            <wp:extent cx="5334000" cy="2963333"/>
+            <wp:effectExtent b="0" l="0" r="0" t="0"/>
+            <wp:docPr descr="La cobertura completa y la remediación verificada importan más que la producción de informes de escaneo." title="" id="55" name="Picture"/>
+            <a:graphic>
+              <a:graphicData uri="http://schemas.openxmlformats.org/drawingml/2006/picture">
+                <pic:pic>
+                  <pic:nvPicPr>
+                    <pic:cNvPr descr="media/image7.png" id="56" name="Picture"/>
+                    <pic:cNvPicPr>
+                      <a:picLocks noChangeArrowheads="1" noChangeAspect="1"/>
+                    </pic:cNvPicPr>
+                  </pic:nvPicPr>
+                  <pic:blipFill>
+                    <a:blip r:embed="rId54"/>
+                    <a:stretch>
+                      <a:fillRect/>
+                    </a:stretch>
+                  </pic:blipFill>
+                  <pic:spPr bwMode="auto">
+                    <a:xfrm>
+                      <a:off x="0" y="0"/>
+                      <a:ext cx="5334000" cy="2963333"/>
+                    </a:xfrm>
+                    <a:prstGeom prst="rect">
+                      <a:avLst/>
+                    </a:prstGeom>
+                    <a:noFill/>
+                    <a:ln w="9525">
+                      <a:noFill/>
+                      <a:headEnd/>
+                      <a:tailEnd/>
+                    </a:ln>
+                  </pic:spPr>
+                </pic:pic>
+              </a:graphicData>
+            </a:graphic>
+          </wp:inline>
+        </w:drawing>
+      </w:r>
+    </w:p>
+    <w:p>
+      <w:pPr>
+        <w:pStyle w:val="ImageCaption"/>
+      </w:pPr>
+      <w:r>
+        <w:t xml:space="preserve">La cobertura completa y la remediación verificada importan más que la producción de informes de escaneo.</w:t>
+      </w:r>
     </w:p>
     <w:p>
       <w:pPr>
@@ -7043,8 +7287,8 @@
         <w:t xml:space="preserve">Utilice la guía oficial de CIS Controls v8.1 y la Especificación de Evaluación de Controles para el lenguaje exacto y los criterios de evaluación.</w:t>
       </w:r>
     </w:p>
-    <w:bookmarkEnd w:id="39"/>
-    <w:bookmarkStart w:id="40" w:name="Xc9ae7a6a9f2f867deb1d535d2659da3bc080871"/>
+    <w:bookmarkEnd w:id="57"/>
+    <w:bookmarkStart w:id="58" w:name="Xc9ae7a6a9f2f867deb1d535d2659da3bc080871"/>
     <w:p>
       <w:pPr>
         <w:pStyle w:val="Heading1"/>
@@ -7956,8 +8200,8 @@
         <w:t xml:space="preserve">Utilice la guía oficial de CIS Controls v8.1 y la Especificación de Evaluación de Controles para el lenguaje exacto y los criterios de evaluación.</w:t>
       </w:r>
     </w:p>
-    <w:bookmarkEnd w:id="40"/>
-    <w:bookmarkStart w:id="41" w:name="X24aed13b821462b02538357a9cec02f47fbc094"/>
+    <w:bookmarkEnd w:id="58"/>
+    <w:bookmarkStart w:id="59" w:name="X24aed13b821462b02538357a9cec02f47fbc094"/>
     <w:p>
       <w:pPr>
         <w:pStyle w:val="Heading1"/>
@@ -8559,8 +8803,8 @@
         <w:t xml:space="preserve">Utilice la guía oficial de CIS Controls v8.1 y la Especificación de Evaluación de Controles para el lenguaje exacto y los criterios de evaluación.</w:t>
       </w:r>
     </w:p>
-    <w:bookmarkEnd w:id="41"/>
-    <w:bookmarkStart w:id="42" w:name="control-10-defensas-contra-malware"/>
+    <w:bookmarkEnd w:id="59"/>
+    <w:bookmarkStart w:id="60" w:name="control-10-defensas-contra-malware"/>
     <w:p>
       <w:pPr>
         <w:pStyle w:val="Heading1"/>
@@ -9162,8 +9406,8 @@
         <w:t xml:space="preserve">Utilice la guía oficial de CIS Controls v8.1 y la Especificación de Evaluación de Controles para el lenguaje exacto y los criterios de evaluación.</w:t>
       </w:r>
     </w:p>
-    <w:bookmarkEnd w:id="42"/>
-    <w:bookmarkStart w:id="43" w:name="control-11-recuperación-de-datos"/>
+    <w:bookmarkEnd w:id="60"/>
+    <w:bookmarkStart w:id="61" w:name="control-11-recuperación-de-datos"/>
     <w:p>
       <w:pPr>
         <w:pStyle w:val="Heading1"/>
@@ -9641,8 +9885,8 @@
         <w:t xml:space="preserve">Utilice la guía oficial de CIS Controls v8.1 y la Especificación de Evaluación de Controles para el lenguaje exacto y los criterios de evaluación.</w:t>
       </w:r>
     </w:p>
-    <w:bookmarkEnd w:id="43"/>
-    <w:bookmarkStart w:id="44" w:name="X304ee8a8ca1b15d2591f68ec8c679233dc80285"/>
+    <w:bookmarkEnd w:id="61"/>
+    <w:bookmarkStart w:id="62" w:name="X304ee8a8ca1b15d2591f68ec8c679233dc80285"/>
     <w:p>
       <w:pPr>
         <w:pStyle w:val="Heading1"/>
@@ -10306,8 +10550,8 @@
         <w:t xml:space="preserve">Utilice la guía oficial de CIS Controls v8.1 y la Especificación de Evaluación de Controles para el lenguaje exacto y los criterios de evaluación.</w:t>
       </w:r>
     </w:p>
-    <w:bookmarkEnd w:id="44"/>
-    <w:bookmarkStart w:id="45" w:name="control-13-monitoreo-y-defensa-de-la-red"/>
+    <w:bookmarkEnd w:id="62"/>
+    <w:bookmarkStart w:id="66" w:name="control-13-monitoreo-y-defensa-de-la-red"/>
     <w:p>
       <w:pPr>
         <w:pStyle w:val="Heading1"/>
@@ -10330,8 +10574,58 @@
     </w:p>
     <w:p>
       <w:pPr>
-        <w:pStyle w:val="BodyText"/>
-      </w:pPr>
+        <w:pStyle w:val="CaptionedFigure"/>
+      </w:pPr>
+      <w:r>
+        <w:drawing>
+          <wp:inline>
+            <wp:extent cx="5334000" cy="2963333"/>
+            <wp:effectExtent b="0" l="0" r="0" t="0"/>
+            <wp:docPr descr="El contexto centralizado, la detección ajustada, la investigación humana y la respuesta crean una defensa útil." title="" id="64" name="Picture"/>
+            <a:graphic>
+              <a:graphicData uri="http://schemas.openxmlformats.org/drawingml/2006/picture">
+                <pic:pic>
+                  <pic:nvPicPr>
+                    <pic:cNvPr descr="media/image8.png" id="65" name="Picture"/>
+                    <pic:cNvPicPr>
+                      <a:picLocks noChangeArrowheads="1" noChangeAspect="1"/>
+                    </pic:cNvPicPr>
+                  </pic:nvPicPr>
+                  <pic:blipFill>
+                    <a:blip r:embed="rId63"/>
+                    <a:stretch>
+                      <a:fillRect/>
+                    </a:stretch>
+                  </pic:blipFill>
+                  <pic:spPr bwMode="auto">
+                    <a:xfrm>
+                      <a:off x="0" y="0"/>
+                      <a:ext cx="5334000" cy="2963333"/>
+                    </a:xfrm>
+                    <a:prstGeom prst="rect">
+                      <a:avLst/>
+                    </a:prstGeom>
+                    <a:noFill/>
+                    <a:ln w="9525">
+                      <a:noFill/>
+                      <a:headEnd/>
+                      <a:tailEnd/>
+                    </a:ln>
+                  </pic:spPr>
+                </pic:pic>
+              </a:graphicData>
+            </a:graphic>
+          </wp:inline>
+        </w:drawing>
+      </w:r>
+    </w:p>
+    <w:p>
+      <w:pPr>
+        <w:pStyle w:val="ImageCaption"/>
+      </w:pPr>
+      <w:r>
+        <w:t xml:space="preserve">El contexto centralizado, la detección ajustada, la investigación humana y la respuesta crean una defensa útil.</w:t>
+      </w:r>
     </w:p>
     <w:p>
       <w:pPr>
@@ -11170,8 +11464,8 @@
         <w:t xml:space="preserve">Utilice la guía oficial de CIS Controls v8.1 y la Especificación de Evaluación de Controles para el lenguaje exacto y los criterios de evaluación.</w:t>
       </w:r>
     </w:p>
-    <w:bookmarkEnd w:id="45"/>
-    <w:bookmarkStart w:id="46" w:name="X4ecc7d63aa0bffe3698d39ecd98ad6666a16b9d"/>
+    <w:bookmarkEnd w:id="66"/>
+    <w:bookmarkStart w:id="67" w:name="X4ecc7d63aa0bffe3698d39ecd98ad6666a16b9d"/>
     <w:p>
       <w:pPr>
         <w:pStyle w:val="Heading1"/>
@@ -11897,8 +12191,8 @@
         <w:t xml:space="preserve">Utilice la guía oficial de CIS Controls v8.1 y la Especificación de Evaluación de Controles para el lenguaje exacto y los criterios de evaluación.</w:t>
       </w:r>
     </w:p>
-    <w:bookmarkEnd w:id="46"/>
-    <w:bookmarkStart w:id="47" w:name="Xa048e4e27fdd744a5076bc25010520fdecc0c30"/>
+    <w:bookmarkEnd w:id="67"/>
+    <w:bookmarkStart w:id="68" w:name="Xa048e4e27fdd744a5076bc25010520fdecc0c30"/>
     <w:p>
       <w:pPr>
         <w:pStyle w:val="Heading1"/>
@@ -12500,8 +12794,8 @@
         <w:t xml:space="preserve">Utilice la guía oficial de CIS Controls v8.1 y la Especificación de Evaluación de Controles para el lenguaje exacto y los criterios de evaluación.</w:t>
       </w:r>
     </w:p>
-    <w:bookmarkEnd w:id="47"/>
-    <w:bookmarkStart w:id="48" w:name="X5e0698034c3a8368f1d805de3798727b85c54b8"/>
+    <w:bookmarkEnd w:id="68"/>
+    <w:bookmarkStart w:id="69" w:name="X5e0698034c3a8368f1d805de3798727b85c54b8"/>
     <w:p>
       <w:pPr>
         <w:pStyle w:val="Heading1"/>
@@ -13537,8 +13831,8 @@
         <w:t xml:space="preserve">Utilice la guía oficial de CIS Controls v8.1 y la Especificación de Evaluación de Controles para el lenguaje exacto y los criterios de evaluación.</w:t>
       </w:r>
     </w:p>
-    <w:bookmarkEnd w:id="48"/>
-    <w:bookmarkStart w:id="49" w:name="X81bcab1ee2e08fb2cedbb65af68432a47fa8998"/>
+    <w:bookmarkEnd w:id="69"/>
+    <w:bookmarkStart w:id="73" w:name="X81bcab1ee2e08fb2cedbb65af68432a47fa8998"/>
     <w:p>
       <w:pPr>
         <w:pStyle w:val="Heading1"/>
@@ -13559,31 +13853,53 @@
         <w:t xml:space="preserve">Las nueve Salvaguardas, su significado en lenguaje claro, el enfoque de verificación y ejemplos de evidencia.</w:t>
       </w:r>
     </w:p>
-    <w:tbl>
-      <w:tblPr>
-        <w:tblStyle w:val="FigureTable"/>
-        <w:tblW w:type="auto" w:w="0"/>
-        <w:tblLook w:firstRow="0" w:lastRow="0" w:firstColumn="0" w:lastColumn="0"/>
-        <w:jc w:val="center"/>
-      </w:tblPr>
-      <w:tblGrid>
-        <w:gridCol w:w="7920"/>
-      </w:tblGrid>
-      <w:tr>
-        <w:tc>
-          <w:tcPr/>
-          <w:p>
-            <w:pPr>
-              <w:pStyle w:val="Compact"/>
-              <w:jc w:val="center"/>
-            </w:pPr>
-            <w:r>
-              <w:t xml:space="preserve">Los roles preparados, los mecanismos de reporte, la comunicación, los ejercicios y las revisiones reducen el impacto de los incidentes.</w:t>
-            </w:r>
-          </w:p>
-        </w:tc>
-      </w:tr>
-    </w:tbl>
+    <w:p>
+      <w:pPr>
+        <w:pStyle w:val="CaptionedFigure"/>
+      </w:pPr>
+      <w:r>
+        <w:drawing>
+          <wp:inline>
+            <wp:extent cx="5334000" cy="2963333"/>
+            <wp:effectExtent b="0" l="0" r="0" t="0"/>
+            <wp:docPr descr="Los roles preparados, los mecanismos de reporte, la comunicación, los ejercicios y las revisiones reducen el impacto de los incidentes." title="" id="71" name="Picture"/>
+            <a:graphic>
+              <a:graphicData uri="http://schemas.openxmlformats.org/drawingml/2006/picture">
+                <pic:pic>
+                  <pic:nvPicPr>
+                    <pic:cNvPr descr="media/image9.png" id="72" name="Picture"/>
+                    <pic:cNvPicPr>
+                      <a:picLocks noChangeArrowheads="1" noChangeAspect="1"/>
+                    </pic:cNvPicPr>
+                  </pic:nvPicPr>
+                  <pic:blipFill>
+                    <a:blip r:embed="rId70"/>
+                    <a:stretch>
+                      <a:fillRect/>
+                    </a:stretch>
+                  </pic:blipFill>
+                  <pic:spPr bwMode="auto">
+                    <a:xfrm>
+                      <a:off x="0" y="0"/>
+                      <a:ext cx="5334000" cy="2963333"/>
+                    </a:xfrm>
+                    <a:prstGeom prst="rect">
+                      <a:avLst/>
+                    </a:prstGeom>
+                    <a:noFill/>
+                    <a:ln w="9525">
+                      <a:noFill/>
+                      <a:headEnd/>
+                      <a:tailEnd/>
+                    </a:ln>
+                  </pic:spPr>
+                </pic:pic>
+              </a:graphicData>
+            </a:graphic>
+          </wp:inline>
+        </w:drawing>
+      </w:r>
+    </w:p>
     <w:p>
       <w:pPr>
         <w:pStyle w:val="ImageCaption"/>
@@ -14305,8 +14621,8 @@
         <w:t xml:space="preserve">Utilice la guía oficial de CIS Controls v8.1 y la Especificación para la Evaluación de Controles para consultar el lenguaje exacto de cada Salvaguarda, la clase de activo, la función de seguridad, el Grupo de Implementación, las dependencias, las entradas, las operaciones, las medidas, las métricas y la revisión de procedimientos.</w:t>
       </w:r>
     </w:p>
-    <w:bookmarkEnd w:id="49"/>
-    <w:bookmarkStart w:id="50" w:name="control-18-pruebas-de-penetración"/>
+    <w:bookmarkEnd w:id="73"/>
+    <w:bookmarkStart w:id="74" w:name="control-18-pruebas-de-penetración"/>
     <w:p>
       <w:pPr>
         <w:pStyle w:val="Heading1"/>
@@ -14784,8 +15100,8 @@
         <w:t xml:space="preserve">Utilice la guía oficial de CIS Controls v8.1 y la Especificación para la Evaluación de Controles para consultar el lenguaje exacto de cada Salvaguarda, la clase de activo, la función de seguridad, el Grupo de Implementación, las dependencias, las entradas, las operaciones, las medidas, las métricas y la revisión de procedimientos.</w:t>
       </w:r>
     </w:p>
-    <w:bookmarkEnd w:id="50"/>
-    <w:bookmarkStart w:id="51" w:name="herramientas-de-código-abierto"/>
+    <w:bookmarkEnd w:id="74"/>
+    <w:bookmarkStart w:id="75" w:name="herramientas-de-código-abierto"/>
     <w:p>
       <w:pPr>
         <w:pStyle w:val="Heading1"/>
@@ -15519,8 +15835,8 @@
         </w:tc>
       </w:tr>
     </w:tbl>
-    <w:bookmarkEnd w:id="51"/>
-    <w:bookmarkStart w:id="52" w:name="Xbc4a4dbf2d9ff0eb677f14739cf1d43ac88337f"/>
+    <w:bookmarkEnd w:id="75"/>
+    <w:bookmarkStart w:id="76" w:name="Xbc4a4dbf2d9ff0eb677f14739cf1d43ac88337f"/>
     <w:p>
       <w:pPr>
         <w:pStyle w:val="Heading1"/>
@@ -15999,8 +16315,8 @@
         </w:tc>
       </w:tr>
     </w:tbl>
-    <w:bookmarkEnd w:id="52"/>
-    <w:bookmarkStart w:id="54" w:name="guía-profesional-para-analistas-junior"/>
+    <w:bookmarkEnd w:id="76"/>
+    <w:bookmarkStart w:id="81" w:name="guía-profesional-para-analistas-junior"/>
     <w:p>
       <w:pPr>
         <w:pStyle w:val="Heading1"/>
@@ -16021,31 +16337,53 @@
         <w:t xml:space="preserve">Una ruta práctica hacia trabajos de controles, vulnerabilidades, aseguramiento, GRC y operaciones de seguridad.</w:t>
       </w:r>
     </w:p>
-    <w:tbl>
-      <w:tblPr>
-        <w:tblStyle w:val="FigureTable"/>
-        <w:tblW w:type="auto" w:w="0"/>
-        <w:tblLook w:firstRow="0" w:lastRow="0" w:firstColumn="0" w:lastColumn="0"/>
-        <w:jc w:val="center"/>
-      </w:tblPr>
-      <w:tblGrid>
-        <w:gridCol w:w="7920"/>
-      </w:tblGrid>
-      <w:tr>
-        <w:tc>
-          <w:tcPr/>
-          <w:p>
-            <w:pPr>
-              <w:pStyle w:val="Compact"/>
-              <w:jc w:val="center"/>
-            </w:pPr>
-            <w:r>
-              <w:t xml:space="preserve">Aprenda el marco, relacione las Salvaguardas, mida la evidencia, informe las brechas y construya un portafolio honesto.</w:t>
-            </w:r>
-          </w:p>
-        </w:tc>
-      </w:tr>
-    </w:tbl>
+    <w:p>
+      <w:pPr>
+        <w:pStyle w:val="CaptionedFigure"/>
+      </w:pPr>
+      <w:r>
+        <w:drawing>
+          <wp:inline>
+            <wp:extent cx="5334000" cy="2963333"/>
+            <wp:effectExtent b="0" l="0" r="0" t="0"/>
+            <wp:docPr descr="Aprenda el marco, relacione las Salvaguardas, mida la evidencia, informe las brechas y construya un portafolio honesto." title="" id="78" name="Picture"/>
+            <a:graphic>
+              <a:graphicData uri="http://schemas.openxmlformats.org/drawingml/2006/picture">
+                <pic:pic>
+                  <pic:nvPicPr>
+                    <pic:cNvPr descr="media/image10.png" id="79" name="Picture"/>
+                    <pic:cNvPicPr>
+                      <a:picLocks noChangeArrowheads="1" noChangeAspect="1"/>
+                    </pic:cNvPicPr>
+                  </pic:nvPicPr>
+                  <pic:blipFill>
+                    <a:blip r:embed="rId77"/>
+                    <a:stretch>
+                      <a:fillRect/>
+                    </a:stretch>
+                  </pic:blipFill>
+                  <pic:spPr bwMode="auto">
+                    <a:xfrm>
+                      <a:off x="0" y="0"/>
+                      <a:ext cx="5334000" cy="2963333"/>
+                    </a:xfrm>
+                    <a:prstGeom prst="rect">
+                      <a:avLst/>
+                    </a:prstGeom>
+                    <a:noFill/>
+                    <a:ln w="9525">
+                      <a:noFill/>
+                      <a:headEnd/>
+                      <a:tailEnd/>
+                    </a:ln>
+                  </pic:spPr>
+                </pic:pic>
+              </a:graphicData>
+            </a:graphic>
+          </wp:inline>
+        </w:drawing>
+      </w:r>
+    </w:p>
     <w:p>
       <w:pPr>
         <w:pStyle w:val="ImageCaption"/>
@@ -16126,7 +16464,7 @@
         <w:t xml:space="preserve">Analista de programas de ciberseguridad</w:t>
       </w:r>
     </w:p>
-    <w:bookmarkStart w:id="53" w:name="trabajo-típico-de-nivel-junior"/>
+    <w:bookmarkStart w:id="80" w:name="trabajo-típico-de-nivel-junior"/>
     <w:p>
       <w:pPr>
         <w:pStyle w:val="Heading2"/>
@@ -16443,9 +16781,9 @@
         </w:tc>
       </w:tr>
     </w:tbl>
-    <w:bookmarkEnd w:id="53"/>
-    <w:bookmarkEnd w:id="54"/>
-    <w:bookmarkStart w:id="55" w:name="laboratorio-y-portafolio-ficticios"/>
+    <w:bookmarkEnd w:id="80"/>
+    <w:bookmarkEnd w:id="81"/>
+    <w:bookmarkStart w:id="82" w:name="laboratorio-y-portafolio-ficticios"/>
     <w:p>
       <w:pPr>
         <w:pStyle w:val="Heading1"/>
@@ -16882,8 +17220,8 @@
         </w:tc>
       </w:tr>
     </w:tbl>
-    <w:bookmarkEnd w:id="55"/>
-    <w:bookmarkStart w:id="56" w:name="plan-de-aprendizaje-de-treinta-días"/>
+    <w:bookmarkEnd w:id="82"/>
+    <w:bookmarkStart w:id="83" w:name="plan-de-aprendizaje-de-treinta-días"/>
     <w:p>
       <w:pPr>
         <w:pStyle w:val="Heading1"/>
@@ -17312,8 +17650,8 @@
         </w:tc>
       </w:tr>
     </w:tbl>
-    <w:bookmarkEnd w:id="56"/>
-    <w:bookmarkStart w:id="65" w:name="cuáles-son-los-controles-cis"/>
+    <w:bookmarkEnd w:id="83"/>
+    <w:bookmarkStart w:id="92" w:name="cuáles-son-los-controles-cis"/>
     <w:p>
       <w:pPr>
         <w:pStyle w:val="Heading1"/>
@@ -17330,7 +17668,7 @@
         <w:t xml:space="preserve">Un conjunto priorizado de mejores prácticas defensivas organizadas en 18 Controles y 153 Salvaguardias enfocadas.</w:t>
       </w:r>
     </w:p>
-    <w:bookmarkStart w:id="57" w:name="qué-es-ig1"/>
+    <w:bookmarkStart w:id="84" w:name="qué-es-ig1"/>
     <w:p>
       <w:pPr>
         <w:pStyle w:val="Heading2"/>
@@ -17347,8 +17685,8 @@
         <w:t xml:space="preserve">El punto de partida esencial de la higiene cibernética 56-Safeguard que CIS recomienda que cada empresa comience.</w:t>
       </w:r>
     </w:p>
-    <w:bookmarkEnd w:id="57"/>
-    <w:bookmarkStart w:id="58" w:name="importa-ig1-cada-requisito"/>
+    <w:bookmarkEnd w:id="84"/>
+    <w:bookmarkStart w:id="85" w:name="importa-ig1-cada-requisito"/>
     <w:p>
       <w:pPr>
         <w:pStyle w:val="Heading2"/>
@@ -17365,8 +17703,8 @@
         <w:t xml:space="preserve">Es una base de referencia de priorización. El riesgo material, los contratos, las leyes, los clientes o los servicios críticos pueden requerir salvaguardias adicionales.</w:t>
       </w:r>
     </w:p>
-    <w:bookmarkEnd w:id="58"/>
-    <w:bookmarkStart w:id="59" w:name="cómo-mide-una-salvaguardia"/>
+    <w:bookmarkEnd w:id="85"/>
+    <w:bookmarkStart w:id="86" w:name="cómo-mide-una-salvaguardia"/>
     <w:p>
       <w:pPr>
         <w:pStyle w:val="Heading2"/>
@@ -17383,8 +17721,8 @@
         <w:t xml:space="preserve">Utilizar criterios oficiales, dependencias, hipótesis, aportaciones completas, operaciones definidas, medidas, métricas, revisión de procedimientos, excepciones y pruebas.</w:t>
       </w:r>
     </w:p>
-    <w:bookmarkEnd w:id="59"/>
-    <w:bookmarkStart w:id="60" w:name="por-qué-son-importantes-los-inventarios"/>
+    <w:bookmarkEnd w:id="86"/>
+    <w:bookmarkStart w:id="87" w:name="por-qué-son-importantes-los-inventarios"/>
     <w:p>
       <w:pPr>
         <w:pStyle w:val="Heading2"/>
@@ -17401,8 +17739,8 @@
         <w:t xml:space="preserve">Definen a las poblaciones que deben cubrir los controles de configuración, vulnerabilidad, registro, recuperación y respuesta.</w:t>
       </w:r>
     </w:p>
-    <w:bookmarkEnd w:id="60"/>
-    <w:bookmarkStart w:id="61" w:name="X0178e2ad2964cbab3c805028646c475c824a062"/>
+    <w:bookmarkEnd w:id="87"/>
+    <w:bookmarkStart w:id="88" w:name="X0178e2ad2964cbab3c805028646c475c824a062"/>
     <w:p>
       <w:pPr>
         <w:pStyle w:val="Heading2"/>
@@ -17419,8 +17757,8 @@
         <w:t xml:space="preserve">Un escaneo identifica principalmente debilidades conocidas; la prueba de penetración utiliza el análisis humano calificado y la explotación controlada para evaluar el impacto y la resiliencia.</w:t>
       </w:r>
     </w:p>
-    <w:bookmarkEnd w:id="61"/>
-    <w:bookmarkStart w:id="62" w:name="X2a3d8d973bfa0b5ed7501efb90ac72ec1b0ecc0"/>
+    <w:bookmarkEnd w:id="88"/>
+    <w:bookmarkStart w:id="89" w:name="X2a3d8d973bfa0b5ed7501efb90ac72ec1b0ecc0"/>
     <w:p>
       <w:pPr>
         <w:pStyle w:val="Heading2"/>
@@ -17437,8 +17775,8 @@
         <w:t xml:space="preserve">No. Identifica las relaciones, pero la organización debe probar el requisito y la evidencia exacta aplicable.</w:t>
       </w:r>
     </w:p>
-    <w:bookmarkEnd w:id="62"/>
-    <w:bookmarkStart w:id="63" w:name="qué-puede-concluir-un-analista-junior"/>
+    <w:bookmarkEnd w:id="89"/>
+    <w:bookmarkStart w:id="90" w:name="qué-puede-concluir-un-analista-junior"/>
     <w:p>
       <w:pPr>
         <w:pStyle w:val="Heading2"/>
@@ -17455,8 +17793,8 @@
         <w:t xml:space="preserve">Sólo lo que el alcance definido y el soporte de evidencia confiable, con muestreo y limitaciones claramente reveladas.</w:t>
       </w:r>
     </w:p>
-    <w:bookmarkEnd w:id="63"/>
-    <w:bookmarkStart w:id="64" w:name="preguntas-para-hacer-al-empleador"/>
+    <w:bookmarkEnd w:id="90"/>
+    <w:bookmarkStart w:id="91" w:name="preguntas-para-hacer-al-empleador"/>
     <w:p>
       <w:pPr>
         <w:pStyle w:val="Heading2"/>
@@ -17521,9 +17859,9 @@
         <w:t xml:space="preserve">¿Cómo revisará el trabajo de los funcionarios superiores?</w:t>
       </w:r>
     </w:p>
-    <w:bookmarkEnd w:id="64"/>
-    <w:bookmarkEnd w:id="65"/>
-    <w:bookmarkStart w:id="75" w:name="plantillas-glosario-índice-y-referencias"/>
+    <w:bookmarkEnd w:id="91"/>
+    <w:bookmarkEnd w:id="92"/>
+    <w:bookmarkStart w:id="102" w:name="plantillas-glosario-índice-y-referencias"/>
     <w:p>
       <w:pPr>
         <w:pStyle w:val="Heading1"/>
@@ -17544,7 +17882,7 @@
         <w:t xml:space="preserve">Estructuras de trabajo reutilizables, términos importantes y puntos de partida autorizados.</w:t>
       </w:r>
     </w:p>
-    <w:bookmarkStart w:id="66" w:name="hoja-de-trabajo-para-medir-salvaguardas"/>
+    <w:bookmarkStart w:id="93" w:name="hoja-de-trabajo-para-medir-salvaguardas"/>
     <w:p>
       <w:pPr>
         <w:pStyle w:val="Heading2"/>
@@ -17854,8 +18192,8 @@
         </w:tc>
       </w:tr>
     </w:tbl>
-    <w:bookmarkEnd w:id="66"/>
-    <w:bookmarkStart w:id="67" w:name="registro-de-hallazgos-y-nuevas-pruebas"/>
+    <w:bookmarkEnd w:id="93"/>
+    <w:bookmarkStart w:id="94" w:name="registro-de-hallazgos-y-nuevas-pruebas"/>
     <w:p>
       <w:pPr>
         <w:pStyle w:val="Heading2"/>
@@ -18165,8 +18503,8 @@
         </w:tc>
       </w:tr>
     </w:tbl>
-    <w:bookmarkEnd w:id="67"/>
-    <w:bookmarkStart w:id="68" w:name="glosario"/>
+    <w:bookmarkEnd w:id="94"/>
+    <w:bookmarkStart w:id="95" w:name="glosario"/>
     <w:p>
       <w:pPr>
         <w:pStyle w:val="Heading2"/>
@@ -18554,8 +18892,8 @@
         </w:tc>
       </w:tr>
     </w:tbl>
-    <w:bookmarkEnd w:id="68"/>
-    <w:bookmarkStart w:id="69" w:name="índice-temático"/>
+    <w:bookmarkEnd w:id="95"/>
+    <w:bookmarkStart w:id="96" w:name="índice-temático"/>
     <w:p>
       <w:pPr>
         <w:pStyle w:val="Heading2"/>
@@ -19021,8 +19359,8 @@
         </w:tc>
       </w:tr>
     </w:tbl>
-    <w:bookmarkEnd w:id="69"/>
-    <w:bookmarkStart w:id="74" w:name="referencias-oficiales"/>
+    <w:bookmarkEnd w:id="96"/>
+    <w:bookmarkStart w:id="101" w:name="referencias-oficiales"/>
     <w:p>
       <w:pPr>
         <w:pStyle w:val="Heading2"/>
@@ -19039,7 +19377,7 @@
         </w:numPr>
         <w:pStyle w:val="Compact"/>
       </w:pPr>
-      <w:hyperlink r:id="rId70">
+      <w:hyperlink r:id="rId97">
         <w:r>
           <w:rPr>
             <w:rStyle w:val="Hyperlink"/>
@@ -19056,7 +19394,7 @@
         </w:numPr>
         <w:pStyle w:val="Compact"/>
       </w:pPr>
-      <w:hyperlink r:id="rId71">
+      <w:hyperlink r:id="rId98">
         <w:r>
           <w:rPr>
             <w:rStyle w:val="Hyperlink"/>
@@ -19073,7 +19411,7 @@
         </w:numPr>
         <w:pStyle w:val="Compact"/>
       </w:pPr>
-      <w:hyperlink r:id="rId72">
+      <w:hyperlink r:id="rId99">
         <w:r>
           <w:rPr>
             <w:rStyle w:val="Hyperlink"/>
@@ -19090,7 +19428,7 @@
         </w:numPr>
         <w:pStyle w:val="Compact"/>
       </w:pPr>
-      <w:hyperlink r:id="rId73">
+      <w:hyperlink r:id="rId100">
         <w:r>
           <w:rPr>
             <w:rStyle w:val="Hyperlink"/>
@@ -19099,8 +19437,8 @@
         </w:r>
       </w:hyperlink>
     </w:p>
-    <w:bookmarkEnd w:id="74"/>
-    <w:bookmarkEnd w:id="75"/>
+    <w:bookmarkEnd w:id="101"/>
+    <w:bookmarkEnd w:id="102"/>
     <w:sectPr/>
   </w:body>
 </w:document>

</xml_diff>